<commit_message>
docs: fill practice 2 blanks according to updated specification
</commit_message>
<xml_diff>
--- a/Бланки практика 2.docx
+++ b/Бланки практика 2.docx
@@ -6,7 +6,7 @@
       <w:pPr>
         <w:pStyle w:val="Normal"/>
         <w:bidi w:val="0"/>
-        <w:spacing w:before="0" w:after="120"/>
+        <w:spacing w:before="40" w:after="40"/>
         <w:ind w:hanging="0"/>
         <w:jc w:val="both"/>
         <w:rPr>
@@ -15,20 +15,20 @@
           <w:sz w:val="28"/>
         </w:rPr>
       </w:pPr>
+      <w:r/>
       <w:r>
         <w:rPr>
           <w:rFonts w:ascii="Times New Roman" w:hAnsi="Times New Roman"/>
-          <w:b w:val="false"/>
           <w:sz w:val="28"/>
         </w:rPr>
-        <w:t>Группа: ____________</w:t>
+        <w:t>Группа: Вкусно_и_Жир</w:t>
       </w:r>
     </w:p>
     <w:p>
       <w:pPr>
         <w:pStyle w:val="Normal"/>
         <w:bidi w:val="0"/>
-        <w:spacing w:before="0" w:after="120"/>
+        <w:spacing w:before="40" w:after="40"/>
         <w:ind w:hanging="0"/>
         <w:jc w:val="both"/>
         <w:rPr>
@@ -37,20 +37,20 @@
           <w:sz w:val="28"/>
         </w:rPr>
       </w:pPr>
+      <w:r/>
       <w:r>
         <w:rPr>
           <w:rFonts w:ascii="Times New Roman" w:hAnsi="Times New Roman"/>
-          <w:b w:val="false"/>
           <w:sz w:val="28"/>
         </w:rPr>
-        <w:t xml:space="preserve">Команда: ______________________    </w:t>
+        <w:t>Команда: Умный ресторан (Конструктор схем и бронирование)</w:t>
       </w:r>
     </w:p>
     <w:p>
       <w:pPr>
         <w:pStyle w:val="Normal"/>
         <w:bidi w:val="0"/>
-        <w:spacing w:before="0" w:after="120"/>
+        <w:spacing w:before="40" w:after="40"/>
         <w:ind w:hanging="0"/>
         <w:jc w:val="both"/>
         <w:rPr>
@@ -59,13 +59,13 @@
           <w:sz w:val="28"/>
         </w:rPr>
       </w:pPr>
+      <w:r/>
       <w:r>
         <w:rPr>
           <w:rFonts w:ascii="Times New Roman" w:hAnsi="Times New Roman"/>
-          <w:b w:val="false"/>
           <w:sz w:val="28"/>
         </w:rPr>
-        <w:t>Дата: ____________</w:t>
+        <w:t>Дата: 04.10.2026</w:t>
       </w:r>
     </w:p>
     <w:p>
@@ -312,18 +312,14 @@
           </w:tcPr>
           <w:p>
             <w:pPr>
-              <w:pStyle w:val="Normal"/>
-              <w:keepNext w:val="true"/>
-              <w:bidi w:val="0"/>
-              <w:spacing w:lineRule="auto" w:line="240" w:before="0" w:after="0"/>
-              <w:ind w:hanging="0"/>
-              <w:jc w:val="start"/>
-              <w:rPr/>
-            </w:pPr>
-            <w:r>
-              <w:rPr>
-                <w:rFonts w:ascii="Times New Roman" w:hAnsi="Times New Roman"/>
-                <w:sz w:val="24"/>
+              <w:spacing w:before="20" w:after="20" w:line="276" w:lineRule="auto"/>
+            </w:pPr>
+            <w:r/>
+            <w:r>
+              <w:rPr>
+                <w:rFonts w:ascii="Times New Roman" w:hAnsi="Times New Roman"/>
+                <w:b w:val="0"/>
+                <w:sz w:val="21"/>
               </w:rPr>
               <w:t>1</w:t>
             </w:r>
@@ -341,16 +337,16 @@
           </w:tcPr>
           <w:p>
             <w:pPr>
-              <w:pStyle w:val="Normal"/>
-              <w:keepNext w:val="true"/>
-              <w:bidi w:val="0"/>
-              <w:spacing w:lineRule="auto" w:line="240" w:before="0" w:after="0"/>
-              <w:ind w:hanging="0"/>
-              <w:jc w:val="start"/>
-              <w:rPr/>
-            </w:pPr>
-            <w:r>
-              <w:rPr/>
+              <w:spacing w:before="20" w:after="20" w:line="276" w:lineRule="auto"/>
+            </w:pPr>
+            <w:r/>
+            <w:r>
+              <w:rPr>
+                <w:rFonts w:ascii="Times New Roman" w:hAnsi="Times New Roman"/>
+                <w:b/>
+                <w:sz w:val="21"/>
+              </w:rPr>
+              <w:t>Restoplace</w:t>
             </w:r>
           </w:p>
         </w:tc>
@@ -366,16 +362,16 @@
           </w:tcPr>
           <w:p>
             <w:pPr>
-              <w:pStyle w:val="Normal"/>
-              <w:keepNext w:val="true"/>
-              <w:bidi w:val="0"/>
-              <w:spacing w:lineRule="auto" w:line="240" w:before="0" w:after="0"/>
-              <w:ind w:hanging="0"/>
-              <w:jc w:val="start"/>
-              <w:rPr/>
-            </w:pPr>
-            <w:r>
-              <w:rPr/>
+              <w:spacing w:before="20" w:after="20" w:line="276" w:lineRule="auto"/>
+            </w:pPr>
+            <w:r/>
+            <w:r>
+              <w:rPr>
+                <w:rFonts w:ascii="Times New Roman" w:hAnsi="Times New Roman"/>
+                <w:b w:val="0"/>
+                <w:sz w:val="21"/>
+              </w:rPr>
+              <w:t>прямой</w:t>
             </w:r>
           </w:p>
         </w:tc>
@@ -391,16 +387,16 @@
           </w:tcPr>
           <w:p>
             <w:pPr>
-              <w:pStyle w:val="Normal"/>
-              <w:keepNext w:val="true"/>
-              <w:bidi w:val="0"/>
-              <w:spacing w:lineRule="auto" w:line="240" w:before="0" w:after="0"/>
-              <w:ind w:hanging="0"/>
-              <w:jc w:val="start"/>
-              <w:rPr/>
-            </w:pPr>
-            <w:r>
-              <w:rPr/>
+              <w:spacing w:before="20" w:after="20" w:line="276" w:lineRule="auto"/>
+            </w:pPr>
+            <w:r/>
+            <w:r>
+              <w:rPr>
+                <w:rFonts w:ascii="Times New Roman" w:hAnsi="Times New Roman"/>
+                <w:b w:val="0"/>
+                <w:sz w:val="21"/>
+              </w:rPr>
+              <w:t>restoplace.ws</w:t>
             </w:r>
           </w:p>
         </w:tc>
@@ -416,16 +412,16 @@
           </w:tcPr>
           <w:p>
             <w:pPr>
-              <w:pStyle w:val="Normal"/>
-              <w:keepNext w:val="true"/>
-              <w:bidi w:val="0"/>
-              <w:spacing w:lineRule="auto" w:line="240" w:before="0" w:after="0"/>
-              <w:ind w:hanging="0"/>
-              <w:jc w:val="start"/>
-              <w:rPr/>
-            </w:pPr>
-            <w:r>
-              <w:rPr/>
+              <w:spacing w:before="20" w:after="20" w:line="276" w:lineRule="auto"/>
+            </w:pPr>
+            <w:r/>
+            <w:r>
+              <w:rPr>
+                <w:rFonts w:ascii="Times New Roman" w:hAnsi="Times New Roman"/>
+                <w:b w:val="0"/>
+                <w:sz w:val="21"/>
+              </w:rPr>
+              <w:t>04.10.2026</w:t>
             </w:r>
           </w:p>
         </w:tc>
@@ -441,16 +437,16 @@
           </w:tcPr>
           <w:p>
             <w:pPr>
-              <w:pStyle w:val="Normal"/>
-              <w:keepNext w:val="true"/>
-              <w:bidi w:val="0"/>
-              <w:spacing w:lineRule="auto" w:line="240" w:before="0" w:after="0"/>
-              <w:ind w:hanging="0"/>
-              <w:jc w:val="start"/>
-              <w:rPr/>
-            </w:pPr>
-            <w:r>
-              <w:rPr/>
+              <w:spacing w:before="20" w:after="20" w:line="276" w:lineRule="auto"/>
+            </w:pPr>
+            <w:r/>
+            <w:r>
+              <w:rPr>
+                <w:rFonts w:ascii="Times New Roman" w:hAnsi="Times New Roman"/>
+                <w:b w:val="0"/>
+                <w:sz w:val="21"/>
+              </w:rPr>
+              <w:t>Популярный российский сервис бронирования с визуальным 2D-конструктором залов и виджетом для сайта; эталон целевой функциональности.</w:t>
             </w:r>
           </w:p>
         </w:tc>
@@ -472,18 +468,14 @@
           </w:tcPr>
           <w:p>
             <w:pPr>
-              <w:pStyle w:val="Normal"/>
-              <w:keepNext w:val="true"/>
-              <w:bidi w:val="0"/>
-              <w:spacing w:lineRule="auto" w:line="240" w:before="0" w:after="0"/>
-              <w:ind w:hanging="0"/>
-              <w:jc w:val="start"/>
-              <w:rPr/>
-            </w:pPr>
-            <w:r>
-              <w:rPr>
-                <w:rFonts w:ascii="Times New Roman" w:hAnsi="Times New Roman"/>
-                <w:sz w:val="24"/>
+              <w:spacing w:before="20" w:after="20" w:line="276" w:lineRule="auto"/>
+            </w:pPr>
+            <w:r/>
+            <w:r>
+              <w:rPr>
+                <w:rFonts w:ascii="Times New Roman" w:hAnsi="Times New Roman"/>
+                <w:b w:val="0"/>
+                <w:sz w:val="21"/>
               </w:rPr>
               <w:t>2</w:t>
             </w:r>
@@ -501,16 +493,16 @@
           </w:tcPr>
           <w:p>
             <w:pPr>
-              <w:pStyle w:val="Normal"/>
-              <w:keepNext w:val="true"/>
-              <w:bidi w:val="0"/>
-              <w:spacing w:lineRule="auto" w:line="240" w:before="0" w:after="0"/>
-              <w:ind w:hanging="0"/>
-              <w:jc w:val="start"/>
-              <w:rPr/>
-            </w:pPr>
-            <w:r>
-              <w:rPr/>
+              <w:spacing w:before="20" w:after="20" w:line="276" w:lineRule="auto"/>
+            </w:pPr>
+            <w:r/>
+            <w:r>
+              <w:rPr>
+                <w:rFonts w:ascii="Times New Roman" w:hAnsi="Times New Roman"/>
+                <w:b/>
+                <w:sz w:val="21"/>
+              </w:rPr>
+              <w:t>OpenTable</w:t>
             </w:r>
           </w:p>
         </w:tc>
@@ -526,16 +518,16 @@
           </w:tcPr>
           <w:p>
             <w:pPr>
-              <w:pStyle w:val="Normal"/>
-              <w:keepNext w:val="true"/>
-              <w:bidi w:val="0"/>
-              <w:spacing w:lineRule="auto" w:line="240" w:before="0" w:after="0"/>
-              <w:ind w:hanging="0"/>
-              <w:jc w:val="start"/>
-              <w:rPr/>
-            </w:pPr>
-            <w:r>
-              <w:rPr/>
+              <w:spacing w:before="20" w:after="20" w:line="276" w:lineRule="auto"/>
+            </w:pPr>
+            <w:r/>
+            <w:r>
+              <w:rPr>
+                <w:rFonts w:ascii="Times New Roman" w:hAnsi="Times New Roman"/>
+                <w:b w:val="0"/>
+                <w:sz w:val="21"/>
+              </w:rPr>
+              <w:t>прямой</w:t>
             </w:r>
           </w:p>
         </w:tc>
@@ -551,16 +543,16 @@
           </w:tcPr>
           <w:p>
             <w:pPr>
-              <w:pStyle w:val="Normal"/>
-              <w:keepNext w:val="true"/>
-              <w:bidi w:val="0"/>
-              <w:spacing w:lineRule="auto" w:line="240" w:before="0" w:after="0"/>
-              <w:ind w:hanging="0"/>
-              <w:jc w:val="start"/>
-              <w:rPr/>
-            </w:pPr>
-            <w:r>
-              <w:rPr/>
+              <w:spacing w:before="20" w:after="20" w:line="276" w:lineRule="auto"/>
+            </w:pPr>
+            <w:r/>
+            <w:r>
+              <w:rPr>
+                <w:rFonts w:ascii="Times New Roman" w:hAnsi="Times New Roman"/>
+                <w:b w:val="0"/>
+                <w:sz w:val="21"/>
+              </w:rPr>
+              <w:t>opentable.com</w:t>
             </w:r>
           </w:p>
         </w:tc>
@@ -576,16 +568,16 @@
           </w:tcPr>
           <w:p>
             <w:pPr>
-              <w:pStyle w:val="Normal"/>
-              <w:keepNext w:val="true"/>
-              <w:bidi w:val="0"/>
-              <w:spacing w:lineRule="auto" w:line="240" w:before="0" w:after="0"/>
-              <w:ind w:hanging="0"/>
-              <w:jc w:val="start"/>
-              <w:rPr/>
-            </w:pPr>
-            <w:r>
-              <w:rPr/>
+              <w:spacing w:before="20" w:after="20" w:line="276" w:lineRule="auto"/>
+            </w:pPr>
+            <w:r/>
+            <w:r>
+              <w:rPr>
+                <w:rFonts w:ascii="Times New Roman" w:hAnsi="Times New Roman"/>
+                <w:b w:val="0"/>
+                <w:sz w:val="21"/>
+              </w:rPr>
+              <w:t>04.10.2026</w:t>
             </w:r>
           </w:p>
         </w:tc>
@@ -601,16 +593,16 @@
           </w:tcPr>
           <w:p>
             <w:pPr>
-              <w:pStyle w:val="Normal"/>
-              <w:keepNext w:val="true"/>
-              <w:bidi w:val="0"/>
-              <w:spacing w:lineRule="auto" w:line="240" w:before="0" w:after="0"/>
-              <w:ind w:hanging="0"/>
-              <w:jc w:val="start"/>
-              <w:rPr/>
-            </w:pPr>
-            <w:r>
-              <w:rPr/>
+              <w:spacing w:before="20" w:after="20" w:line="276" w:lineRule="auto"/>
+            </w:pPr>
+            <w:r/>
+            <w:r>
+              <w:rPr>
+                <w:rFonts w:ascii="Times New Roman" w:hAnsi="Times New Roman"/>
+                <w:b w:val="0"/>
+                <w:sz w:val="21"/>
+              </w:rPr>
+              <w:t>Мировой лидер Table Management; эталон журнала броней (шахматки), статусов посадки и управления залом ресторана.</w:t>
             </w:r>
           </w:p>
         </w:tc>
@@ -632,18 +624,14 @@
           </w:tcPr>
           <w:p>
             <w:pPr>
-              <w:pStyle w:val="Normal"/>
-              <w:keepNext w:val="true"/>
-              <w:bidi w:val="0"/>
-              <w:spacing w:lineRule="auto" w:line="240" w:before="0" w:after="0"/>
-              <w:ind w:hanging="0"/>
-              <w:jc w:val="start"/>
-              <w:rPr/>
-            </w:pPr>
-            <w:r>
-              <w:rPr>
-                <w:rFonts w:ascii="Times New Roman" w:hAnsi="Times New Roman"/>
-                <w:sz w:val="24"/>
+              <w:spacing w:before="20" w:after="20" w:line="276" w:lineRule="auto"/>
+            </w:pPr>
+            <w:r/>
+            <w:r>
+              <w:rPr>
+                <w:rFonts w:ascii="Times New Roman" w:hAnsi="Times New Roman"/>
+                <w:b w:val="0"/>
+                <w:sz w:val="21"/>
               </w:rPr>
               <w:t>3</w:t>
             </w:r>
@@ -661,16 +649,16 @@
           </w:tcPr>
           <w:p>
             <w:pPr>
-              <w:pStyle w:val="Normal"/>
-              <w:keepNext w:val="true"/>
-              <w:bidi w:val="0"/>
-              <w:spacing w:lineRule="auto" w:line="240" w:before="0" w:after="0"/>
-              <w:ind w:hanging="0"/>
-              <w:jc w:val="start"/>
-              <w:rPr/>
-            </w:pPr>
-            <w:r>
-              <w:rPr/>
+              <w:spacing w:before="20" w:after="20" w:line="276" w:lineRule="auto"/>
+            </w:pPr>
+            <w:r/>
+            <w:r>
+              <w:rPr>
+                <w:rFonts w:ascii="Times New Roman" w:hAnsi="Times New Roman"/>
+                <w:b/>
+                <w:sz w:val="21"/>
+              </w:rPr>
+              <w:t>LeClick</w:t>
             </w:r>
           </w:p>
         </w:tc>
@@ -686,16 +674,16 @@
           </w:tcPr>
           <w:p>
             <w:pPr>
-              <w:pStyle w:val="Normal"/>
-              <w:keepNext w:val="true"/>
-              <w:bidi w:val="0"/>
-              <w:spacing w:lineRule="auto" w:line="240" w:before="0" w:after="0"/>
-              <w:ind w:hanging="0"/>
-              <w:jc w:val="start"/>
-              <w:rPr/>
-            </w:pPr>
-            <w:r>
-              <w:rPr/>
+              <w:spacing w:before="20" w:after="20" w:line="276" w:lineRule="auto"/>
+            </w:pPr>
+            <w:r/>
+            <w:r>
+              <w:rPr>
+                <w:rFonts w:ascii="Times New Roman" w:hAnsi="Times New Roman"/>
+                <w:b w:val="0"/>
+                <w:sz w:val="21"/>
+              </w:rPr>
+              <w:t>прямой</w:t>
             </w:r>
           </w:p>
         </w:tc>
@@ -711,16 +699,16 @@
           </w:tcPr>
           <w:p>
             <w:pPr>
-              <w:pStyle w:val="Normal"/>
-              <w:keepNext w:val="true"/>
-              <w:bidi w:val="0"/>
-              <w:spacing w:lineRule="auto" w:line="240" w:before="0" w:after="0"/>
-              <w:ind w:hanging="0"/>
-              <w:jc w:val="start"/>
-              <w:rPr/>
-            </w:pPr>
-            <w:r>
-              <w:rPr/>
+              <w:spacing w:before="20" w:after="20" w:line="276" w:lineRule="auto"/>
+            </w:pPr>
+            <w:r/>
+            <w:r>
+              <w:rPr>
+                <w:rFonts w:ascii="Times New Roman" w:hAnsi="Times New Roman"/>
+                <w:b w:val="0"/>
+                <w:sz w:val="21"/>
+              </w:rPr>
+              <w:t>leclick.ru</w:t>
             </w:r>
           </w:p>
         </w:tc>
@@ -736,16 +724,16 @@
           </w:tcPr>
           <w:p>
             <w:pPr>
-              <w:pStyle w:val="Normal"/>
-              <w:keepNext w:val="true"/>
-              <w:bidi w:val="0"/>
-              <w:spacing w:lineRule="auto" w:line="240" w:before="0" w:after="0"/>
-              <w:ind w:hanging="0"/>
-              <w:jc w:val="start"/>
-              <w:rPr/>
-            </w:pPr>
-            <w:r>
-              <w:rPr/>
+              <w:spacing w:before="20" w:after="20" w:line="276" w:lineRule="auto"/>
+            </w:pPr>
+            <w:r/>
+            <w:r>
+              <w:rPr>
+                <w:rFonts w:ascii="Times New Roman" w:hAnsi="Times New Roman"/>
+                <w:b w:val="0"/>
+                <w:sz w:val="21"/>
+              </w:rPr>
+              <w:t>04.10.2026</w:t>
             </w:r>
           </w:p>
         </w:tc>
@@ -761,16 +749,16 @@
           </w:tcPr>
           <w:p>
             <w:pPr>
-              <w:pStyle w:val="Normal"/>
-              <w:keepNext w:val="true"/>
-              <w:bidi w:val="0"/>
-              <w:spacing w:lineRule="auto" w:line="240" w:before="0" w:after="0"/>
-              <w:ind w:hanging="0"/>
-              <w:jc w:val="start"/>
-              <w:rPr/>
-            </w:pPr>
-            <w:r>
-              <w:rPr/>
+              <w:spacing w:before="20" w:after="20" w:line="276" w:lineRule="auto"/>
+            </w:pPr>
+            <w:r/>
+            <w:r>
+              <w:rPr>
+                <w:rFonts w:ascii="Times New Roman" w:hAnsi="Times New Roman"/>
+                <w:b w:val="0"/>
+                <w:sz w:val="21"/>
+              </w:rPr>
+              <w:t>Российский сервис онлайн-бронирования столиков и автоматизации хостес; полезен для анализа логики буферного времени между бронями.</w:t>
             </w:r>
           </w:p>
         </w:tc>
@@ -792,18 +780,14 @@
           </w:tcPr>
           <w:p>
             <w:pPr>
-              <w:pStyle w:val="Normal"/>
-              <w:keepNext w:val="true"/>
-              <w:bidi w:val="0"/>
-              <w:spacing w:lineRule="auto" w:line="240" w:before="0" w:after="0"/>
-              <w:ind w:hanging="0"/>
-              <w:jc w:val="start"/>
-              <w:rPr/>
-            </w:pPr>
-            <w:r>
-              <w:rPr>
-                <w:rFonts w:ascii="Times New Roman" w:hAnsi="Times New Roman"/>
-                <w:sz w:val="24"/>
+              <w:spacing w:before="20" w:after="20" w:line="276" w:lineRule="auto"/>
+            </w:pPr>
+            <w:r/>
+            <w:r>
+              <w:rPr>
+                <w:rFonts w:ascii="Times New Roman" w:hAnsi="Times New Roman"/>
+                <w:b w:val="0"/>
+                <w:sz w:val="21"/>
               </w:rPr>
               <w:t>4</w:t>
             </w:r>
@@ -821,16 +805,16 @@
           </w:tcPr>
           <w:p>
             <w:pPr>
-              <w:pStyle w:val="Normal"/>
-              <w:keepNext w:val="true"/>
-              <w:bidi w:val="0"/>
-              <w:spacing w:lineRule="auto" w:line="240" w:before="0" w:after="0"/>
-              <w:ind w:hanging="0"/>
-              <w:jc w:val="start"/>
-              <w:rPr/>
-            </w:pPr>
-            <w:r>
-              <w:rPr/>
+              <w:spacing w:before="20" w:after="20" w:line="276" w:lineRule="auto"/>
+            </w:pPr>
+            <w:r/>
+            <w:r>
+              <w:rPr>
+                <w:rFonts w:ascii="Times New Roman" w:hAnsi="Times New Roman"/>
+                <w:b/>
+                <w:sz w:val="21"/>
+              </w:rPr>
+              <w:t>Яндекс Карты (Бронирование)</w:t>
             </w:r>
           </w:p>
         </w:tc>
@@ -846,16 +830,16 @@
           </w:tcPr>
           <w:p>
             <w:pPr>
-              <w:pStyle w:val="Normal"/>
-              <w:keepNext w:val="true"/>
-              <w:bidi w:val="0"/>
-              <w:spacing w:lineRule="auto" w:line="240" w:before="0" w:after="0"/>
-              <w:ind w:hanging="0"/>
-              <w:jc w:val="start"/>
-              <w:rPr/>
-            </w:pPr>
-            <w:r>
-              <w:rPr/>
+              <w:spacing w:before="20" w:after="20" w:line="276" w:lineRule="auto"/>
+            </w:pPr>
+            <w:r/>
+            <w:r>
+              <w:rPr>
+                <w:rFonts w:ascii="Times New Roman" w:hAnsi="Times New Roman"/>
+                <w:b w:val="0"/>
+                <w:sz w:val="21"/>
+              </w:rPr>
+              <w:t>косвенный</w:t>
             </w:r>
           </w:p>
         </w:tc>
@@ -871,16 +855,16 @@
           </w:tcPr>
           <w:p>
             <w:pPr>
-              <w:pStyle w:val="Normal"/>
-              <w:keepNext w:val="true"/>
-              <w:bidi w:val="0"/>
-              <w:spacing w:lineRule="auto" w:line="240" w:before="0" w:after="0"/>
-              <w:ind w:hanging="0"/>
-              <w:jc w:val="start"/>
-              <w:rPr/>
-            </w:pPr>
-            <w:r>
-              <w:rPr/>
+              <w:spacing w:before="20" w:after="20" w:line="276" w:lineRule="auto"/>
+            </w:pPr>
+            <w:r/>
+            <w:r>
+              <w:rPr>
+                <w:rFonts w:ascii="Times New Roman" w:hAnsi="Times New Roman"/>
+                <w:b w:val="0"/>
+                <w:sz w:val="21"/>
+              </w:rPr>
+              <w:t>yandex.ru/maps</w:t>
             </w:r>
           </w:p>
         </w:tc>
@@ -896,16 +880,16 @@
           </w:tcPr>
           <w:p>
             <w:pPr>
-              <w:pStyle w:val="Normal"/>
-              <w:keepNext w:val="true"/>
-              <w:bidi w:val="0"/>
-              <w:spacing w:lineRule="auto" w:line="240" w:before="0" w:after="0"/>
-              <w:ind w:hanging="0"/>
-              <w:jc w:val="start"/>
-              <w:rPr/>
-            </w:pPr>
-            <w:r>
-              <w:rPr/>
+              <w:spacing w:before="20" w:after="20" w:line="276" w:lineRule="auto"/>
+            </w:pPr>
+            <w:r/>
+            <w:r>
+              <w:rPr>
+                <w:rFonts w:ascii="Times New Roman" w:hAnsi="Times New Roman"/>
+                <w:b w:val="0"/>
+                <w:sz w:val="21"/>
+              </w:rPr>
+              <w:t>04.10.2026</w:t>
             </w:r>
           </w:p>
         </w:tc>
@@ -921,16 +905,16 @@
           </w:tcPr>
           <w:p>
             <w:pPr>
-              <w:pStyle w:val="Normal"/>
-              <w:keepNext w:val="true"/>
-              <w:bidi w:val="0"/>
-              <w:spacing w:lineRule="auto" w:line="240" w:before="0" w:after="0"/>
-              <w:ind w:hanging="0"/>
-              <w:jc w:val="start"/>
-              <w:rPr/>
-            </w:pPr>
-            <w:r>
-              <w:rPr/>
+              <w:spacing w:before="20" w:after="20" w:line="276" w:lineRule="auto"/>
+            </w:pPr>
+            <w:r/>
+            <w:r>
+              <w:rPr>
+                <w:rFonts w:ascii="Times New Roman" w:hAnsi="Times New Roman"/>
+                <w:b w:val="0"/>
+                <w:sz w:val="21"/>
+              </w:rPr>
+              <w:t>Крупнейший агрегатор онлайн-бронирования в РФ; эталон UX подбора времени/гостей, но бронирование ведется без выбора стола на схеме зала.</w:t>
             </w:r>
           </w:p>
         </w:tc>
@@ -952,18 +936,14 @@
           </w:tcPr>
           <w:p>
             <w:pPr>
-              <w:pStyle w:val="Normal"/>
-              <w:keepNext w:val="true"/>
-              <w:bidi w:val="0"/>
-              <w:spacing w:lineRule="auto" w:line="240" w:before="0" w:after="0"/>
-              <w:ind w:hanging="0"/>
-              <w:jc w:val="start"/>
-              <w:rPr/>
-            </w:pPr>
-            <w:r>
-              <w:rPr>
-                <w:rFonts w:ascii="Times New Roman" w:hAnsi="Times New Roman"/>
-                <w:sz w:val="24"/>
+              <w:spacing w:before="20" w:after="20" w:line="276" w:lineRule="auto"/>
+            </w:pPr>
+            <w:r/>
+            <w:r>
+              <w:rPr>
+                <w:rFonts w:ascii="Times New Roman" w:hAnsi="Times New Roman"/>
+                <w:b w:val="0"/>
+                <w:sz w:val="21"/>
               </w:rPr>
               <w:t>5</w:t>
             </w:r>
@@ -981,16 +961,16 @@
           </w:tcPr>
           <w:p>
             <w:pPr>
-              <w:pStyle w:val="Normal"/>
-              <w:keepNext w:val="true"/>
-              <w:bidi w:val="0"/>
-              <w:spacing w:lineRule="auto" w:line="240" w:before="0" w:after="0"/>
-              <w:ind w:hanging="0"/>
-              <w:jc w:val="start"/>
-              <w:rPr/>
-            </w:pPr>
-            <w:r>
-              <w:rPr/>
+              <w:spacing w:before="20" w:after="20" w:line="276" w:lineRule="auto"/>
+            </w:pPr>
+            <w:r/>
+            <w:r>
+              <w:rPr>
+                <w:rFonts w:ascii="Times New Roman" w:hAnsi="Times New Roman"/>
+                <w:b/>
+                <w:sz w:val="21"/>
+              </w:rPr>
+              <w:t>Бумажный журнал хостес и звонки</w:t>
             </w:r>
           </w:p>
         </w:tc>
@@ -1006,16 +986,16 @@
           </w:tcPr>
           <w:p>
             <w:pPr>
-              <w:pStyle w:val="Normal"/>
-              <w:keepNext w:val="true"/>
-              <w:bidi w:val="0"/>
-              <w:spacing w:lineRule="auto" w:line="240" w:before="0" w:after="0"/>
-              <w:ind w:hanging="0"/>
-              <w:jc w:val="start"/>
-              <w:rPr/>
-            </w:pPr>
-            <w:r>
-              <w:rPr/>
+              <w:spacing w:before="20" w:after="20" w:line="276" w:lineRule="auto"/>
+            </w:pPr>
+            <w:r/>
+            <w:r>
+              <w:rPr>
+                <w:rFonts w:ascii="Times New Roman" w:hAnsi="Times New Roman"/>
+                <w:b w:val="0"/>
+                <w:sz w:val="21"/>
+              </w:rPr>
+              <w:t>текущий способ</w:t>
             </w:r>
           </w:p>
         </w:tc>
@@ -1031,16 +1011,16 @@
           </w:tcPr>
           <w:p>
             <w:pPr>
-              <w:pStyle w:val="Normal"/>
-              <w:keepNext w:val="true"/>
-              <w:bidi w:val="0"/>
-              <w:spacing w:lineRule="auto" w:line="240" w:before="0" w:after="0"/>
-              <w:ind w:hanging="0"/>
-              <w:jc w:val="start"/>
-              <w:rPr/>
-            </w:pPr>
-            <w:r>
-              <w:rPr/>
+              <w:spacing w:before="20" w:after="20" w:line="276" w:lineRule="auto"/>
+            </w:pPr>
+            <w:r/>
+            <w:r>
+              <w:rPr>
+                <w:rFonts w:ascii="Times New Roman" w:hAnsi="Times New Roman"/>
+                <w:b w:val="0"/>
+                <w:sz w:val="21"/>
+              </w:rPr>
+              <w:t>Практика ресторанов без автоматизации</w:t>
             </w:r>
           </w:p>
         </w:tc>
@@ -1056,16 +1036,16 @@
           </w:tcPr>
           <w:p>
             <w:pPr>
-              <w:pStyle w:val="Normal"/>
-              <w:keepNext w:val="true"/>
-              <w:bidi w:val="0"/>
-              <w:spacing w:lineRule="auto" w:line="240" w:before="0" w:after="0"/>
-              <w:ind w:hanging="0"/>
-              <w:jc w:val="start"/>
-              <w:rPr/>
-            </w:pPr>
-            <w:r>
-              <w:rPr/>
+              <w:spacing w:before="20" w:after="20" w:line="276" w:lineRule="auto"/>
+            </w:pPr>
+            <w:r/>
+            <w:r>
+              <w:rPr>
+                <w:rFonts w:ascii="Times New Roman" w:hAnsi="Times New Roman"/>
+                <w:b w:val="0"/>
+                <w:sz w:val="21"/>
+              </w:rPr>
+              <w:t>04.10.2026</w:t>
             </w:r>
           </w:p>
         </w:tc>
@@ -1081,16 +1061,16 @@
           </w:tcPr>
           <w:p>
             <w:pPr>
-              <w:pStyle w:val="Normal"/>
-              <w:keepNext w:val="true"/>
-              <w:bidi w:val="0"/>
-              <w:spacing w:lineRule="auto" w:line="240" w:before="0" w:after="0"/>
-              <w:ind w:hanging="0"/>
-              <w:jc w:val="start"/>
-              <w:rPr/>
-            </w:pPr>
-            <w:r>
-              <w:rPr/>
+              <w:spacing w:before="20" w:after="20" w:line="276" w:lineRule="auto"/>
+            </w:pPr>
+            <w:r/>
+            <w:r>
+              <w:rPr>
+                <w:rFonts w:ascii="Times New Roman" w:hAnsi="Times New Roman"/>
+                <w:b w:val="0"/>
+                <w:sz w:val="21"/>
+              </w:rPr>
+              <w:t>Базовый способ решения задачи, который продукт заменяет; источник ошибок, человеческого фактора, потери гостей и овербукинга.</w:t>
             </w:r>
           </w:p>
         </w:tc>
@@ -1112,17 +1092,14 @@
           </w:tcPr>
           <w:p>
             <w:pPr>
-              <w:pStyle w:val="Normal"/>
-              <w:bidi w:val="0"/>
-              <w:spacing w:lineRule="auto" w:line="240" w:before="0" w:after="0"/>
-              <w:ind w:hanging="0"/>
-              <w:jc w:val="start"/>
-              <w:rPr/>
-            </w:pPr>
-            <w:r>
-              <w:rPr>
-                <w:rFonts w:ascii="Times New Roman" w:hAnsi="Times New Roman"/>
-                <w:sz w:val="24"/>
+              <w:spacing w:before="20" w:after="20" w:line="276" w:lineRule="auto"/>
+            </w:pPr>
+            <w:r/>
+            <w:r>
+              <w:rPr>
+                <w:rFonts w:ascii="Times New Roman" w:hAnsi="Times New Roman"/>
+                <w:b w:val="0"/>
+                <w:sz w:val="21"/>
               </w:rPr>
               <w:t>6</w:t>
             </w:r>
@@ -1140,15 +1117,16 @@
           </w:tcPr>
           <w:p>
             <w:pPr>
-              <w:pStyle w:val="Normal"/>
-              <w:bidi w:val="0"/>
-              <w:spacing w:lineRule="auto" w:line="240" w:before="0" w:after="0"/>
-              <w:ind w:hanging="0"/>
-              <w:jc w:val="start"/>
-              <w:rPr/>
-            </w:pPr>
-            <w:r>
-              <w:rPr/>
+              <w:spacing w:before="20" w:after="20" w:line="276" w:lineRule="auto"/>
+            </w:pPr>
+            <w:r/>
+            <w:r>
+              <w:rPr>
+                <w:rFonts w:ascii="Times New Roman" w:hAnsi="Times New Roman"/>
+                <w:b/>
+                <w:sz w:val="21"/>
+              </w:rPr>
+              <w:t>Floorplanner</w:t>
             </w:r>
           </w:p>
         </w:tc>
@@ -1164,15 +1142,16 @@
           </w:tcPr>
           <w:p>
             <w:pPr>
-              <w:pStyle w:val="Normal"/>
-              <w:bidi w:val="0"/>
-              <w:spacing w:lineRule="auto" w:line="240" w:before="0" w:after="0"/>
-              <w:ind w:hanging="0"/>
-              <w:jc w:val="start"/>
-              <w:rPr/>
-            </w:pPr>
-            <w:r>
-              <w:rPr/>
+              <w:spacing w:before="20" w:after="20" w:line="276" w:lineRule="auto"/>
+            </w:pPr>
+            <w:r/>
+            <w:r>
+              <w:rPr>
+                <w:rFonts w:ascii="Times New Roman" w:hAnsi="Times New Roman"/>
+                <w:b w:val="0"/>
+                <w:sz w:val="21"/>
+              </w:rPr>
+              <w:t>референс</w:t>
             </w:r>
           </w:p>
         </w:tc>
@@ -1188,15 +1167,16 @@
           </w:tcPr>
           <w:p>
             <w:pPr>
-              <w:pStyle w:val="Normal"/>
-              <w:bidi w:val="0"/>
-              <w:spacing w:lineRule="auto" w:line="240" w:before="0" w:after="0"/>
-              <w:ind w:hanging="0"/>
-              <w:jc w:val="start"/>
-              <w:rPr/>
-            </w:pPr>
-            <w:r>
-              <w:rPr/>
+              <w:spacing w:before="20" w:after="20" w:line="276" w:lineRule="auto"/>
+            </w:pPr>
+            <w:r/>
+            <w:r>
+              <w:rPr>
+                <w:rFonts w:ascii="Times New Roman" w:hAnsi="Times New Roman"/>
+                <w:b w:val="0"/>
+                <w:sz w:val="21"/>
+              </w:rPr>
+              <w:t>floorplanner.com</w:t>
             </w:r>
           </w:p>
         </w:tc>
@@ -1212,15 +1192,16 @@
           </w:tcPr>
           <w:p>
             <w:pPr>
-              <w:pStyle w:val="Normal"/>
-              <w:bidi w:val="0"/>
-              <w:spacing w:lineRule="auto" w:line="240" w:before="0" w:after="0"/>
-              <w:ind w:hanging="0"/>
-              <w:jc w:val="start"/>
-              <w:rPr/>
-            </w:pPr>
-            <w:r>
-              <w:rPr/>
+              <w:spacing w:before="20" w:after="20" w:line="276" w:lineRule="auto"/>
+            </w:pPr>
+            <w:r/>
+            <w:r>
+              <w:rPr>
+                <w:rFonts w:ascii="Times New Roman" w:hAnsi="Times New Roman"/>
+                <w:b w:val="0"/>
+                <w:sz w:val="21"/>
+              </w:rPr>
+              <w:t>04.10.2026</w:t>
             </w:r>
           </w:p>
         </w:tc>
@@ -1236,15 +1217,16 @@
           </w:tcPr>
           <w:p>
             <w:pPr>
-              <w:pStyle w:val="Normal"/>
-              <w:bidi w:val="0"/>
-              <w:spacing w:lineRule="auto" w:line="240" w:before="0" w:after="0"/>
-              <w:ind w:hanging="0"/>
-              <w:jc w:val="start"/>
-              <w:rPr/>
-            </w:pPr>
-            <w:r>
-              <w:rPr/>
+              <w:spacing w:before="20" w:after="20" w:line="276" w:lineRule="auto"/>
+            </w:pPr>
+            <w:r/>
+            <w:r>
+              <w:rPr>
+                <w:rFonts w:ascii="Times New Roman" w:hAnsi="Times New Roman"/>
+                <w:b w:val="0"/>
+                <w:sz w:val="21"/>
+              </w:rPr>
+              <w:t>Референс эргономики 2D-веб-редактора: плавный drag-and-drop объектов, полигоны стен/зон, вращение столов и привязка к сетке.</w:t>
             </w:r>
           </w:p>
         </w:tc>
@@ -1399,18 +1381,14 @@
           </w:tcPr>
           <w:p>
             <w:pPr>
-              <w:pStyle w:val="Normal"/>
-              <w:keepNext w:val="true"/>
-              <w:bidi w:val="0"/>
-              <w:spacing w:lineRule="auto" w:line="240" w:before="0" w:after="0"/>
-              <w:ind w:hanging="0"/>
-              <w:jc w:val="start"/>
-              <w:rPr/>
-            </w:pPr>
-            <w:r>
-              <w:rPr>
-                <w:rFonts w:ascii="Times New Roman" w:hAnsi="Times New Roman"/>
-                <w:sz w:val="24"/>
+              <w:spacing w:before="20" w:after="20" w:line="276" w:lineRule="auto"/>
+            </w:pPr>
+            <w:r/>
+            <w:r>
+              <w:rPr>
+                <w:rFonts w:ascii="Times New Roman" w:hAnsi="Times New Roman"/>
+                <w:b/>
+                <w:sz w:val="21"/>
               </w:rPr>
               <w:t>Функциональность</w:t>
             </w:r>
@@ -1428,16 +1406,16 @@
           </w:tcPr>
           <w:p>
             <w:pPr>
-              <w:pStyle w:val="Normal"/>
-              <w:keepNext w:val="true"/>
-              <w:bidi w:val="0"/>
-              <w:spacing w:lineRule="auto" w:line="240" w:before="0" w:after="0"/>
-              <w:ind w:hanging="0"/>
-              <w:jc w:val="start"/>
-              <w:rPr/>
-            </w:pPr>
-            <w:r>
-              <w:rPr/>
+              <w:spacing w:before="20" w:after="20" w:line="276" w:lineRule="auto"/>
+            </w:pPr>
+            <w:r/>
+            <w:r>
+              <w:rPr>
+                <w:rFonts w:ascii="Times New Roman" w:hAnsi="Times New Roman"/>
+                <w:b w:val="0"/>
+                <w:sz w:val="21"/>
+              </w:rPr>
+              <w:t>Наличие визуального интерактивного 2D-конструктора залов (полигоны зон, расстановка и вращение столов) и модуля онлайн-бронирования стола на слот времени.</w:t>
             </w:r>
           </w:p>
         </w:tc>
@@ -1459,18 +1437,14 @@
           </w:tcPr>
           <w:p>
             <w:pPr>
-              <w:pStyle w:val="Normal"/>
-              <w:keepNext w:val="true"/>
-              <w:bidi w:val="0"/>
-              <w:spacing w:lineRule="auto" w:line="240" w:before="0" w:after="0"/>
-              <w:ind w:hanging="0"/>
-              <w:jc w:val="start"/>
-              <w:rPr/>
-            </w:pPr>
-            <w:r>
-              <w:rPr>
-                <w:rFonts w:ascii="Times New Roman" w:hAnsi="Times New Roman"/>
-                <w:sz w:val="24"/>
+              <w:spacing w:before="20" w:after="20" w:line="276" w:lineRule="auto"/>
+            </w:pPr>
+            <w:r/>
+            <w:r>
+              <w:rPr>
+                <w:rFonts w:ascii="Times New Roman" w:hAnsi="Times New Roman"/>
+                <w:b/>
+                <w:sz w:val="21"/>
               </w:rPr>
               <w:t>Пользовательский сценарий</w:t>
             </w:r>
@@ -1488,16 +1462,16 @@
           </w:tcPr>
           <w:p>
             <w:pPr>
-              <w:pStyle w:val="Normal"/>
-              <w:keepNext w:val="true"/>
-              <w:bidi w:val="0"/>
-              <w:spacing w:lineRule="auto" w:line="240" w:before="0" w:after="0"/>
-              <w:ind w:hanging="0"/>
-              <w:jc w:val="start"/>
-              <w:rPr/>
-            </w:pPr>
-            <w:r>
-              <w:rPr/>
+              <w:spacing w:before="20" w:after="20" w:line="276" w:lineRule="auto"/>
+            </w:pPr>
+            <w:r/>
+            <w:r>
+              <w:rPr>
+                <w:rFonts w:ascii="Times New Roman" w:hAnsi="Times New Roman"/>
+                <w:b w:val="0"/>
+                <w:sz w:val="21"/>
+              </w:rPr>
+              <w:t>Возможность самостоятельного выбора конкретного стола на интерактивной карте зала с цветовой индикацией занятости в реальном времени («зеленый / красный»).</w:t>
             </w:r>
           </w:p>
         </w:tc>
@@ -1519,18 +1493,14 @@
           </w:tcPr>
           <w:p>
             <w:pPr>
-              <w:pStyle w:val="Normal"/>
-              <w:keepNext w:val="true"/>
-              <w:bidi w:val="0"/>
-              <w:spacing w:lineRule="auto" w:line="240" w:before="0" w:after="0"/>
-              <w:ind w:hanging="0"/>
-              <w:jc w:val="start"/>
-              <w:rPr/>
-            </w:pPr>
-            <w:r>
-              <w:rPr>
-                <w:rFonts w:ascii="Times New Roman" w:hAnsi="Times New Roman"/>
-                <w:sz w:val="24"/>
+              <w:spacing w:before="20" w:after="20" w:line="276" w:lineRule="auto"/>
+            </w:pPr>
+            <w:r/>
+            <w:r>
+              <w:rPr>
+                <w:rFonts w:ascii="Times New Roman" w:hAnsi="Times New Roman"/>
+                <w:b/>
+                <w:sz w:val="21"/>
               </w:rPr>
               <w:t>Данные / интеграции</w:t>
             </w:r>
@@ -1548,16 +1518,16 @@
           </w:tcPr>
           <w:p>
             <w:pPr>
-              <w:pStyle w:val="Normal"/>
-              <w:keepNext w:val="true"/>
-              <w:bidi w:val="0"/>
-              <w:spacing w:lineRule="auto" w:line="240" w:before="0" w:after="0"/>
-              <w:ind w:hanging="0"/>
-              <w:jc w:val="start"/>
-              <w:rPr/>
-            </w:pPr>
-            <w:r>
-              <w:rPr/>
+              <w:spacing w:before="20" w:after="20" w:line="276" w:lineRule="auto"/>
+            </w:pPr>
+            <w:r/>
+            <w:r>
+              <w:rPr>
+                <w:rFonts w:ascii="Times New Roman" w:hAnsi="Times New Roman"/>
+                <w:b w:val="0"/>
+                <w:sz w:val="21"/>
+              </w:rPr>
+              <w:t>Версионирование планировок зала (снимки LayoutRevision в JSONB), откат ревизий и REST API для интеграции схемы и виджета бронирования.</w:t>
             </w:r>
           </w:p>
         </w:tc>
@@ -1579,18 +1549,14 @@
           </w:tcPr>
           <w:p>
             <w:pPr>
-              <w:pStyle w:val="Normal"/>
-              <w:keepNext w:val="true"/>
-              <w:bidi w:val="0"/>
-              <w:spacing w:lineRule="auto" w:line="240" w:before="0" w:after="0"/>
-              <w:ind w:hanging="0"/>
-              <w:jc w:val="start"/>
-              <w:rPr/>
-            </w:pPr>
-            <w:r>
-              <w:rPr>
-                <w:rFonts w:ascii="Times New Roman" w:hAnsi="Times New Roman"/>
-                <w:sz w:val="24"/>
+              <w:spacing w:before="20" w:after="20" w:line="276" w:lineRule="auto"/>
+            </w:pPr>
+            <w:r/>
+            <w:r>
+              <w:rPr>
+                <w:rFonts w:ascii="Times New Roman" w:hAnsi="Times New Roman"/>
+                <w:b/>
+                <w:sz w:val="21"/>
               </w:rPr>
               <w:t>Качество системы</w:t>
             </w:r>
@@ -1608,16 +1574,16 @@
           </w:tcPr>
           <w:p>
             <w:pPr>
-              <w:pStyle w:val="Normal"/>
-              <w:keepNext w:val="true"/>
-              <w:bidi w:val="0"/>
-              <w:spacing w:lineRule="auto" w:line="240" w:before="0" w:after="0"/>
-              <w:ind w:hanging="0"/>
-              <w:jc w:val="start"/>
-              <w:rPr/>
-            </w:pPr>
-            <w:r>
-              <w:rPr/>
+              <w:spacing w:before="20" w:after="20" w:line="276" w:lineRule="auto"/>
+            </w:pPr>
+            <w:r/>
+            <w:r>
+              <w:rPr>
+                <w:rFonts w:ascii="Times New Roman" w:hAnsi="Times New Roman"/>
+                <w:b w:val="0"/>
+                <w:sz w:val="21"/>
+              </w:rPr>
+              <w:t>Гарантия отсутствия овербукинга (двойных броней), учет буфера 15 мин на подготовку стола и блокировка публикации схемы при наличии будущих активных броней.</w:t>
             </w:r>
           </w:p>
         </w:tc>
@@ -1639,18 +1605,14 @@
           </w:tcPr>
           <w:p>
             <w:pPr>
-              <w:pStyle w:val="Normal"/>
-              <w:keepNext w:val="true"/>
-              <w:bidi w:val="0"/>
-              <w:spacing w:lineRule="auto" w:line="240" w:before="0" w:after="0"/>
-              <w:ind w:hanging="0"/>
-              <w:jc w:val="start"/>
-              <w:rPr/>
-            </w:pPr>
-            <w:r>
-              <w:rPr>
-                <w:rFonts w:ascii="Times New Roman" w:hAnsi="Times New Roman"/>
-                <w:sz w:val="24"/>
+              <w:spacing w:before="20" w:after="20" w:line="276" w:lineRule="auto"/>
+            </w:pPr>
+            <w:r/>
+            <w:r>
+              <w:rPr>
+                <w:rFonts w:ascii="Times New Roman" w:hAnsi="Times New Roman"/>
+                <w:b/>
+                <w:sz w:val="21"/>
               </w:rPr>
               <w:t>Ограничения и риски</w:t>
             </w:r>
@@ -1668,16 +1630,16 @@
           </w:tcPr>
           <w:p>
             <w:pPr>
-              <w:pStyle w:val="Normal"/>
-              <w:keepNext w:val="true"/>
-              <w:bidi w:val="0"/>
-              <w:spacing w:lineRule="auto" w:line="240" w:before="0" w:after="0"/>
-              <w:ind w:hanging="0"/>
-              <w:jc w:val="start"/>
-              <w:rPr/>
-            </w:pPr>
-            <w:r>
-              <w:rPr/>
+              <w:spacing w:before="20" w:after="20" w:line="276" w:lineRule="auto"/>
+            </w:pPr>
+            <w:r/>
+            <w:r>
+              <w:rPr>
+                <w:rFonts w:ascii="Times New Roman" w:hAnsi="Times New Roman"/>
+                <w:b w:val="0"/>
+                <w:sz w:val="21"/>
+              </w:rPr>
+              <w:t>Работа полностью в веб-браузере без установки стороннего ПО и простота освоения конструктора администратором без профессиональных CAD-навыков.</w:t>
             </w:r>
           </w:p>
         </w:tc>
@@ -1699,18 +1661,14 @@
           </w:tcPr>
           <w:p>
             <w:pPr>
-              <w:pStyle w:val="Normal"/>
-              <w:keepNext w:val="true"/>
-              <w:bidi w:val="0"/>
-              <w:spacing w:lineRule="auto" w:line="240" w:before="0" w:after="0"/>
-              <w:ind w:hanging="0"/>
-              <w:jc w:val="start"/>
-              <w:rPr/>
-            </w:pPr>
-            <w:r>
-              <w:rPr>
-                <w:rFonts w:ascii="Times New Roman" w:hAnsi="Times New Roman"/>
-                <w:sz w:val="24"/>
+              <w:spacing w:before="20" w:after="20" w:line="276" w:lineRule="auto"/>
+            </w:pPr>
+            <w:r/>
+            <w:r>
+              <w:rPr>
+                <w:rFonts w:ascii="Times New Roman" w:hAnsi="Times New Roman"/>
+                <w:b/>
+                <w:sz w:val="21"/>
               </w:rPr>
               <w:t>Ценность для пользователя</w:t>
             </w:r>
@@ -1728,16 +1686,16 @@
           </w:tcPr>
           <w:p>
             <w:pPr>
-              <w:pStyle w:val="Normal"/>
-              <w:keepNext w:val="true"/>
-              <w:bidi w:val="0"/>
-              <w:spacing w:lineRule="auto" w:line="240" w:before="0" w:after="0"/>
-              <w:ind w:hanging="0"/>
-              <w:jc w:val="start"/>
-              <w:rPr/>
-            </w:pPr>
-            <w:r>
-              <w:rPr/>
+              <w:spacing w:before="20" w:after="20" w:line="276" w:lineRule="auto"/>
+            </w:pPr>
+            <w:r/>
+            <w:r>
+              <w:rPr>
+                <w:rFonts w:ascii="Times New Roman" w:hAnsi="Times New Roman"/>
+                <w:b w:val="0"/>
+                <w:sz w:val="21"/>
+              </w:rPr>
+              <w:t>Время самостоятельного бронирования стола гостем (до 1-2 минут без звонка в ресторан) и прозрачный мониторинг загрузки зала менеджером.</w:t>
             </w:r>
           </w:p>
         </w:tc>
@@ -1759,17 +1717,14 @@
           </w:tcPr>
           <w:p>
             <w:pPr>
-              <w:pStyle w:val="Normal"/>
-              <w:bidi w:val="0"/>
-              <w:spacing w:lineRule="auto" w:line="240" w:before="0" w:after="0"/>
-              <w:ind w:hanging="0"/>
-              <w:jc w:val="start"/>
-              <w:rPr/>
-            </w:pPr>
-            <w:r>
-              <w:rPr>
-                <w:rFonts w:ascii="Times New Roman" w:hAnsi="Times New Roman"/>
-                <w:sz w:val="24"/>
+              <w:spacing w:before="20" w:after="20" w:line="276" w:lineRule="auto"/>
+            </w:pPr>
+            <w:r/>
+            <w:r>
+              <w:rPr>
+                <w:rFonts w:ascii="Times New Roman" w:hAnsi="Times New Roman"/>
+                <w:b/>
+                <w:sz w:val="21"/>
               </w:rPr>
               <w:t>Дополнительный критерий команды</w:t>
             </w:r>
@@ -1787,15 +1742,16 @@
           </w:tcPr>
           <w:p>
             <w:pPr>
-              <w:pStyle w:val="Normal"/>
-              <w:bidi w:val="0"/>
-              <w:spacing w:lineRule="auto" w:line="240" w:before="0" w:after="0"/>
-              <w:ind w:hanging="0"/>
-              <w:jc w:val="start"/>
-              <w:rPr/>
-            </w:pPr>
-            <w:r>
-              <w:rPr/>
+              <w:spacing w:before="20" w:after="20" w:line="276" w:lineRule="auto"/>
+            </w:pPr>
+            <w:r/>
+            <w:r>
+              <w:rPr>
+                <w:rFonts w:ascii="Times New Roman" w:hAnsi="Times New Roman"/>
+                <w:b w:val="0"/>
+                <w:sz w:val="21"/>
+              </w:rPr>
+              <w:t>Единый легковесный SVG-рендерер (&lt;FloorPlanSVG&gt;) для всех интерфейсов (конструктор, гость, менеджер) без дублирования кода верстки.</w:t>
             </w:r>
           </w:p>
         </w:tc>
@@ -1888,19 +1844,14 @@
           </w:tcPr>
           <w:p>
             <w:pPr>
-              <w:pStyle w:val="Normal"/>
-              <w:keepNext w:val="true"/>
-              <w:bidi w:val="0"/>
-              <w:spacing w:lineRule="auto" w:line="240" w:before="0" w:after="0"/>
-              <w:ind w:hanging="0"/>
-              <w:jc w:val="center"/>
-              <w:rPr/>
-            </w:pPr>
-            <w:r>
-              <w:rPr>
-                <w:rFonts w:ascii="Times New Roman" w:hAnsi="Times New Roman"/>
-                <w:b/>
-                <w:sz w:val="24"/>
+              <w:spacing w:before="20" w:after="20" w:line="276" w:lineRule="auto"/>
+            </w:pPr>
+            <w:r/>
+            <w:r>
+              <w:rPr>
+                <w:rFonts w:ascii="Times New Roman" w:hAnsi="Times New Roman"/>
+                <w:b/>
+                <w:sz w:val="21"/>
               </w:rPr>
               <w:t>Критерий</w:t>
             </w:r>
@@ -1918,21 +1869,16 @@
           </w:tcPr>
           <w:p>
             <w:pPr>
-              <w:pStyle w:val="Normal"/>
-              <w:keepNext w:val="true"/>
-              <w:bidi w:val="0"/>
-              <w:spacing w:lineRule="auto" w:line="240" w:before="0" w:after="0"/>
-              <w:ind w:hanging="0"/>
-              <w:jc w:val="center"/>
-              <w:rPr/>
-            </w:pPr>
-            <w:r>
-              <w:rPr>
-                <w:rFonts w:ascii="Times New Roman" w:hAnsi="Times New Roman"/>
-                <w:b/>
-                <w:sz w:val="24"/>
-              </w:rPr>
-              <w:t>Аналог 1</w:t>
+              <w:spacing w:before="20" w:after="20" w:line="276" w:lineRule="auto"/>
+            </w:pPr>
+            <w:r/>
+            <w:r>
+              <w:rPr>
+                <w:rFonts w:ascii="Times New Roman" w:hAnsi="Times New Roman"/>
+                <w:b/>
+                <w:sz w:val="21"/>
+              </w:rPr>
+              <w:t>Restoplace</w:t>
             </w:r>
           </w:p>
         </w:tc>
@@ -1948,21 +1894,16 @@
           </w:tcPr>
           <w:p>
             <w:pPr>
-              <w:pStyle w:val="Normal"/>
-              <w:keepNext w:val="true"/>
-              <w:bidi w:val="0"/>
-              <w:spacing w:lineRule="auto" w:line="240" w:before="0" w:after="0"/>
-              <w:ind w:hanging="0"/>
-              <w:jc w:val="center"/>
-              <w:rPr/>
-            </w:pPr>
-            <w:r>
-              <w:rPr>
-                <w:rFonts w:ascii="Times New Roman" w:hAnsi="Times New Roman"/>
-                <w:b/>
-                <w:sz w:val="24"/>
-              </w:rPr>
-              <w:t>Аналог 2</w:t>
+              <w:spacing w:before="20" w:after="20" w:line="276" w:lineRule="auto"/>
+            </w:pPr>
+            <w:r/>
+            <w:r>
+              <w:rPr>
+                <w:rFonts w:ascii="Times New Roman" w:hAnsi="Times New Roman"/>
+                <w:b/>
+                <w:sz w:val="21"/>
+              </w:rPr>
+              <w:t>OpenTable</w:t>
             </w:r>
           </w:p>
         </w:tc>
@@ -1978,21 +1919,16 @@
           </w:tcPr>
           <w:p>
             <w:pPr>
-              <w:pStyle w:val="Normal"/>
-              <w:keepNext w:val="true"/>
-              <w:bidi w:val="0"/>
-              <w:spacing w:lineRule="auto" w:line="240" w:before="0" w:after="0"/>
-              <w:ind w:hanging="0"/>
-              <w:jc w:val="center"/>
-              <w:rPr/>
-            </w:pPr>
-            <w:r>
-              <w:rPr>
-                <w:rFonts w:ascii="Times New Roman" w:hAnsi="Times New Roman"/>
-                <w:b/>
-                <w:sz w:val="24"/>
-              </w:rPr>
-              <w:t>Аналог 3</w:t>
+              <w:spacing w:before="20" w:after="20" w:line="276" w:lineRule="auto"/>
+            </w:pPr>
+            <w:r/>
+            <w:r>
+              <w:rPr>
+                <w:rFonts w:ascii="Times New Roman" w:hAnsi="Times New Roman"/>
+                <w:b/>
+                <w:sz w:val="21"/>
+              </w:rPr>
+              <w:t>Яндекс Карты</w:t>
             </w:r>
           </w:p>
         </w:tc>
@@ -2008,21 +1944,16 @@
           </w:tcPr>
           <w:p>
             <w:pPr>
-              <w:pStyle w:val="Normal"/>
-              <w:keepNext w:val="true"/>
-              <w:bidi w:val="0"/>
-              <w:spacing w:lineRule="auto" w:line="240" w:before="0" w:after="0"/>
-              <w:ind w:hanging="0"/>
-              <w:jc w:val="center"/>
-              <w:rPr/>
-            </w:pPr>
-            <w:r>
-              <w:rPr>
-                <w:rFonts w:ascii="Times New Roman" w:hAnsi="Times New Roman"/>
-                <w:b/>
-                <w:sz w:val="24"/>
-              </w:rPr>
-              <w:t>Текущий способ</w:t>
+              <w:spacing w:before="20" w:after="20" w:line="276" w:lineRule="auto"/>
+            </w:pPr>
+            <w:r/>
+            <w:r>
+              <w:rPr>
+                <w:rFonts w:ascii="Times New Roman" w:hAnsi="Times New Roman"/>
+                <w:b/>
+                <w:sz w:val="21"/>
+              </w:rPr>
+              <w:t>Бумажный журнал</w:t>
             </w:r>
           </w:p>
         </w:tc>
@@ -2038,19 +1969,14 @@
           </w:tcPr>
           <w:p>
             <w:pPr>
-              <w:pStyle w:val="Normal"/>
-              <w:keepNext w:val="true"/>
-              <w:bidi w:val="0"/>
-              <w:spacing w:lineRule="auto" w:line="240" w:before="0" w:after="0"/>
-              <w:ind w:hanging="0"/>
-              <w:jc w:val="center"/>
-              <w:rPr/>
-            </w:pPr>
-            <w:r>
-              <w:rPr>
-                <w:rFonts w:ascii="Times New Roman" w:hAnsi="Times New Roman"/>
-                <w:b/>
-                <w:sz w:val="24"/>
+              <w:spacing w:before="20" w:after="20" w:line="276" w:lineRule="auto"/>
+            </w:pPr>
+            <w:r/>
+            <w:r>
+              <w:rPr>
+                <w:rFonts w:ascii="Times New Roman" w:hAnsi="Times New Roman"/>
+                <w:b/>
+                <w:sz w:val="21"/>
               </w:rPr>
               <w:t>Проверено или по описанию</w:t>
             </w:r>
@@ -2074,16 +2000,16 @@
           </w:tcPr>
           <w:p>
             <w:pPr>
-              <w:pStyle w:val="Normal"/>
-              <w:keepNext w:val="true"/>
-              <w:bidi w:val="0"/>
-              <w:spacing w:lineRule="auto" w:line="240" w:before="0" w:after="0"/>
-              <w:ind w:hanging="0"/>
-              <w:jc w:val="start"/>
-              <w:rPr/>
-            </w:pPr>
-            <w:r>
-              <w:rPr/>
+              <w:spacing w:before="20" w:after="20" w:line="276" w:lineRule="auto"/>
+            </w:pPr>
+            <w:r/>
+            <w:r>
+              <w:rPr>
+                <w:rFonts w:ascii="Times New Roman" w:hAnsi="Times New Roman"/>
+                <w:b/>
+                <w:sz w:val="21"/>
+              </w:rPr>
+              <w:t>Интерактивная 2D-схема залов с выбором стола гостем</w:t>
             </w:r>
           </w:p>
         </w:tc>
@@ -2099,16 +2025,16 @@
           </w:tcPr>
           <w:p>
             <w:pPr>
-              <w:pStyle w:val="Normal"/>
-              <w:keepNext w:val="true"/>
-              <w:bidi w:val="0"/>
-              <w:spacing w:lineRule="auto" w:line="240" w:before="0" w:after="0"/>
-              <w:ind w:hanging="0"/>
-              <w:jc w:val="start"/>
-              <w:rPr/>
-            </w:pPr>
-            <w:r>
-              <w:rPr/>
+              <w:spacing w:before="20" w:after="20" w:line="276" w:lineRule="auto"/>
+            </w:pPr>
+            <w:r/>
+            <w:r>
+              <w:rPr>
+                <w:rFonts w:ascii="Times New Roman" w:hAnsi="Times New Roman"/>
+                <w:b w:val="0"/>
+                <w:sz w:val="21"/>
+              </w:rPr>
+              <w:t>Есть (виджет с картой столов)</w:t>
             </w:r>
           </w:p>
         </w:tc>
@@ -2124,16 +2050,16 @@
           </w:tcPr>
           <w:p>
             <w:pPr>
-              <w:pStyle w:val="Normal"/>
-              <w:keepNext w:val="true"/>
-              <w:bidi w:val="0"/>
-              <w:spacing w:lineRule="auto" w:line="240" w:before="0" w:after="0"/>
-              <w:ind w:hanging="0"/>
-              <w:jc w:val="start"/>
-              <w:rPr/>
-            </w:pPr>
-            <w:r>
-              <w:rPr/>
+              <w:spacing w:before="20" w:after="20" w:line="276" w:lineRule="auto"/>
+            </w:pPr>
+            <w:r/>
+            <w:r>
+              <w:rPr>
+                <w:rFonts w:ascii="Times New Roman" w:hAnsi="Times New Roman"/>
+                <w:b w:val="0"/>
+                <w:sz w:val="21"/>
+              </w:rPr>
+              <w:t>Есть (в приложении для заведений)</w:t>
             </w:r>
           </w:p>
         </w:tc>
@@ -2149,16 +2075,16 @@
           </w:tcPr>
           <w:p>
             <w:pPr>
-              <w:pStyle w:val="Normal"/>
-              <w:keepNext w:val="true"/>
-              <w:bidi w:val="0"/>
-              <w:spacing w:lineRule="auto" w:line="240" w:before="0" w:after="0"/>
-              <w:ind w:hanging="0"/>
-              <w:jc w:val="start"/>
-              <w:rPr/>
-            </w:pPr>
-            <w:r>
-              <w:rPr/>
+              <w:spacing w:before="20" w:after="20" w:line="276" w:lineRule="auto"/>
+            </w:pPr>
+            <w:r/>
+            <w:r>
+              <w:rPr>
+                <w:rFonts w:ascii="Times New Roman" w:hAnsi="Times New Roman"/>
+                <w:b w:val="0"/>
+                <w:sz w:val="21"/>
+              </w:rPr>
+              <w:t>Нет (бронь по числу персон и времени)</w:t>
             </w:r>
           </w:p>
         </w:tc>
@@ -2174,16 +2100,16 @@
           </w:tcPr>
           <w:p>
             <w:pPr>
-              <w:pStyle w:val="Normal"/>
-              <w:keepNext w:val="true"/>
-              <w:bidi w:val="0"/>
-              <w:spacing w:lineRule="auto" w:line="240" w:before="0" w:after="0"/>
-              <w:ind w:hanging="0"/>
-              <w:jc w:val="start"/>
-              <w:rPr/>
-            </w:pPr>
-            <w:r>
-              <w:rPr/>
+              <w:spacing w:before="20" w:after="20" w:line="276" w:lineRule="auto"/>
+            </w:pPr>
+            <w:r/>
+            <w:r>
+              <w:rPr>
+                <w:rFonts w:ascii="Times New Roman" w:hAnsi="Times New Roman"/>
+                <w:b w:val="0"/>
+                <w:sz w:val="21"/>
+              </w:rPr>
+              <w:t>Нет (хостес на словах описывает зал)</w:t>
             </w:r>
           </w:p>
         </w:tc>
@@ -2199,16 +2125,16 @@
           </w:tcPr>
           <w:p>
             <w:pPr>
-              <w:pStyle w:val="Normal"/>
-              <w:keepNext w:val="true"/>
-              <w:bidi w:val="0"/>
-              <w:spacing w:lineRule="auto" w:line="240" w:before="0" w:after="0"/>
-              <w:ind w:hanging="0"/>
-              <w:jc w:val="start"/>
-              <w:rPr/>
-            </w:pPr>
-            <w:r>
-              <w:rPr/>
+              <w:spacing w:before="20" w:after="20" w:line="276" w:lineRule="auto"/>
+            </w:pPr>
+            <w:r/>
+            <w:r>
+              <w:rPr>
+                <w:rFonts w:ascii="Times New Roman" w:hAnsi="Times New Roman"/>
+                <w:b w:val="0"/>
+                <w:sz w:val="21"/>
+              </w:rPr>
+              <w:t>Проверено лично</w:t>
             </w:r>
           </w:p>
         </w:tc>
@@ -2230,16 +2156,16 @@
           </w:tcPr>
           <w:p>
             <w:pPr>
-              <w:pStyle w:val="Normal"/>
-              <w:keepNext w:val="true"/>
-              <w:bidi w:val="0"/>
-              <w:spacing w:lineRule="auto" w:line="240" w:before="0" w:after="0"/>
-              <w:ind w:hanging="0"/>
-              <w:jc w:val="start"/>
-              <w:rPr/>
-            </w:pPr>
-            <w:r>
-              <w:rPr/>
+              <w:spacing w:before="20" w:after="20" w:line="276" w:lineRule="auto"/>
+            </w:pPr>
+            <w:r/>
+            <w:r>
+              <w:rPr>
+                <w:rFonts w:ascii="Times New Roman" w:hAnsi="Times New Roman"/>
+                <w:b/>
+                <w:sz w:val="21"/>
+              </w:rPr>
+              <w:t>Встроенный визуальный 2D-конструктор залов (drag&amp;drop, зоны, столы)</w:t>
             </w:r>
           </w:p>
         </w:tc>
@@ -2255,16 +2181,16 @@
           </w:tcPr>
           <w:p>
             <w:pPr>
-              <w:pStyle w:val="Normal"/>
-              <w:keepNext w:val="true"/>
-              <w:bidi w:val="0"/>
-              <w:spacing w:lineRule="auto" w:line="240" w:before="0" w:after="0"/>
-              <w:ind w:hanging="0"/>
-              <w:jc w:val="start"/>
-              <w:rPr/>
-            </w:pPr>
-            <w:r>
-              <w:rPr/>
+              <w:spacing w:before="20" w:after="20" w:line="276" w:lineRule="auto"/>
+            </w:pPr>
+            <w:r/>
+            <w:r>
+              <w:rPr>
+                <w:rFonts w:ascii="Times New Roman" w:hAnsi="Times New Roman"/>
+                <w:b w:val="0"/>
+                <w:sz w:val="21"/>
+              </w:rPr>
+              <w:t>Есть (web-конструктор)</w:t>
             </w:r>
           </w:p>
         </w:tc>
@@ -2280,16 +2206,16 @@
           </w:tcPr>
           <w:p>
             <w:pPr>
-              <w:pStyle w:val="Normal"/>
-              <w:keepNext w:val="true"/>
-              <w:bidi w:val="0"/>
-              <w:spacing w:lineRule="auto" w:line="240" w:before="0" w:after="0"/>
-              <w:ind w:hanging="0"/>
-              <w:jc w:val="start"/>
-              <w:rPr/>
-            </w:pPr>
-            <w:r>
-              <w:rPr/>
+              <w:spacing w:before="20" w:after="20" w:line="276" w:lineRule="auto"/>
+            </w:pPr>
+            <w:r/>
+            <w:r>
+              <w:rPr>
+                <w:rFonts w:ascii="Times New Roman" w:hAnsi="Times New Roman"/>
+                <w:b w:val="0"/>
+                <w:sz w:val="21"/>
+              </w:rPr>
+              <w:t>Есть (настройка плана через бэк-офис)</w:t>
             </w:r>
           </w:p>
         </w:tc>
@@ -2305,16 +2231,16 @@
           </w:tcPr>
           <w:p>
             <w:pPr>
-              <w:pStyle w:val="Normal"/>
-              <w:keepNext w:val="true"/>
-              <w:bidi w:val="0"/>
-              <w:spacing w:lineRule="auto" w:line="240" w:before="0" w:after="0"/>
-              <w:ind w:hanging="0"/>
-              <w:jc w:val="start"/>
-              <w:rPr/>
-            </w:pPr>
-            <w:r>
-              <w:rPr/>
+              <w:spacing w:before="20" w:after="20" w:line="276" w:lineRule="auto"/>
+            </w:pPr>
+            <w:r/>
+            <w:r>
+              <w:rPr>
+                <w:rFonts w:ascii="Times New Roman" w:hAnsi="Times New Roman"/>
+                <w:b w:val="0"/>
+                <w:sz w:val="21"/>
+              </w:rPr>
+              <w:t>Нет (только списочные параметры заведения)</w:t>
             </w:r>
           </w:p>
         </w:tc>
@@ -2330,16 +2256,16 @@
           </w:tcPr>
           <w:p>
             <w:pPr>
-              <w:pStyle w:val="Normal"/>
-              <w:keepNext w:val="true"/>
-              <w:bidi w:val="0"/>
-              <w:spacing w:lineRule="auto" w:line="240" w:before="0" w:after="0"/>
-              <w:ind w:hanging="0"/>
-              <w:jc w:val="start"/>
-              <w:rPr/>
-            </w:pPr>
-            <w:r>
-              <w:rPr/>
+              <w:spacing w:before="20" w:after="20" w:line="276" w:lineRule="auto"/>
+            </w:pPr>
+            <w:r/>
+            <w:r>
+              <w:rPr>
+                <w:rFonts w:ascii="Times New Roman" w:hAnsi="Times New Roman"/>
+                <w:b w:val="0"/>
+                <w:sz w:val="21"/>
+              </w:rPr>
+              <w:t>Нет (схемы на бумаге или в Excel)</w:t>
             </w:r>
           </w:p>
         </w:tc>
@@ -2355,16 +2281,16 @@
           </w:tcPr>
           <w:p>
             <w:pPr>
-              <w:pStyle w:val="Normal"/>
-              <w:keepNext w:val="true"/>
-              <w:bidi w:val="0"/>
-              <w:spacing w:lineRule="auto" w:line="240" w:before="0" w:after="0"/>
-              <w:ind w:hanging="0"/>
-              <w:jc w:val="start"/>
-              <w:rPr/>
-            </w:pPr>
-            <w:r>
-              <w:rPr/>
+              <w:spacing w:before="20" w:after="20" w:line="276" w:lineRule="auto"/>
+            </w:pPr>
+            <w:r/>
+            <w:r>
+              <w:rPr>
+                <w:rFonts w:ascii="Times New Roman" w:hAnsi="Times New Roman"/>
+                <w:b w:val="0"/>
+                <w:sz w:val="21"/>
+              </w:rPr>
+              <w:t>Проверено лично</w:t>
             </w:r>
           </w:p>
         </w:tc>
@@ -2386,16 +2312,16 @@
           </w:tcPr>
           <w:p>
             <w:pPr>
-              <w:pStyle w:val="Normal"/>
-              <w:keepNext w:val="true"/>
-              <w:bidi w:val="0"/>
-              <w:spacing w:lineRule="auto" w:line="240" w:before="0" w:after="0"/>
-              <w:ind w:hanging="0"/>
-              <w:jc w:val="start"/>
-              <w:rPr/>
-            </w:pPr>
-            <w:r>
-              <w:rPr/>
+              <w:spacing w:before="20" w:after="20" w:line="276" w:lineRule="auto"/>
+            </w:pPr>
+            <w:r/>
+            <w:r>
+              <w:rPr>
+                <w:rFonts w:ascii="Times New Roman" w:hAnsi="Times New Roman"/>
+                <w:b/>
+                <w:sz w:val="21"/>
+              </w:rPr>
+              <w:t>Автоматический учет буфера на подготовку стола (10-15 мин)</w:t>
             </w:r>
           </w:p>
         </w:tc>
@@ -2411,16 +2337,16 @@
           </w:tcPr>
           <w:p>
             <w:pPr>
-              <w:pStyle w:val="Normal"/>
-              <w:keepNext w:val="true"/>
-              <w:bidi w:val="0"/>
-              <w:spacing w:lineRule="auto" w:line="240" w:before="0" w:after="0"/>
-              <w:ind w:hanging="0"/>
-              <w:jc w:val="start"/>
-              <w:rPr/>
-            </w:pPr>
-            <w:r>
-              <w:rPr/>
+              <w:spacing w:before="20" w:after="20" w:line="276" w:lineRule="auto"/>
+            </w:pPr>
+            <w:r/>
+            <w:r>
+              <w:rPr>
+                <w:rFonts w:ascii="Times New Roman" w:hAnsi="Times New Roman"/>
+                <w:b w:val="0"/>
+                <w:sz w:val="21"/>
+              </w:rPr>
+              <w:t>Есть (настраиваемый интервал)</w:t>
             </w:r>
           </w:p>
         </w:tc>
@@ -2436,16 +2362,16 @@
           </w:tcPr>
           <w:p>
             <w:pPr>
-              <w:pStyle w:val="Normal"/>
-              <w:keepNext w:val="true"/>
-              <w:bidi w:val="0"/>
-              <w:spacing w:lineRule="auto" w:line="240" w:before="0" w:after="0"/>
-              <w:ind w:hanging="0"/>
-              <w:jc w:val="start"/>
-              <w:rPr/>
-            </w:pPr>
-            <w:r>
-              <w:rPr/>
+              <w:spacing w:before="20" w:after="20" w:line="276" w:lineRule="auto"/>
+            </w:pPr>
+            <w:r/>
+            <w:r>
+              <w:rPr>
+                <w:rFonts w:ascii="Times New Roman" w:hAnsi="Times New Roman"/>
+                <w:b w:val="0"/>
+                <w:sz w:val="21"/>
+              </w:rPr>
+              <w:t>Есть (гибкая настройка слотов)</w:t>
             </w:r>
           </w:p>
         </w:tc>
@@ -2461,16 +2387,16 @@
           </w:tcPr>
           <w:p>
             <w:pPr>
-              <w:pStyle w:val="Normal"/>
-              <w:keepNext w:val="true"/>
-              <w:bidi w:val="0"/>
-              <w:spacing w:lineRule="auto" w:line="240" w:before="0" w:after="0"/>
-              <w:ind w:hanging="0"/>
-              <w:jc w:val="start"/>
-              <w:rPr/>
-            </w:pPr>
-            <w:r>
-              <w:rPr/>
+              <w:spacing w:before="20" w:after="20" w:line="276" w:lineRule="auto"/>
+            </w:pPr>
+            <w:r/>
+            <w:r>
+              <w:rPr>
+                <w:rFonts w:ascii="Times New Roman" w:hAnsi="Times New Roman"/>
+                <w:b w:val="0"/>
+                <w:sz w:val="21"/>
+              </w:rPr>
+              <w:t>Частично (фиксированные интервалы)</w:t>
             </w:r>
           </w:p>
         </w:tc>
@@ -2486,16 +2412,16 @@
           </w:tcPr>
           <w:p>
             <w:pPr>
-              <w:pStyle w:val="Normal"/>
-              <w:keepNext w:val="true"/>
-              <w:bidi w:val="0"/>
-              <w:spacing w:lineRule="auto" w:line="240" w:before="0" w:after="0"/>
-              <w:ind w:hanging="0"/>
-              <w:jc w:val="start"/>
-              <w:rPr/>
-            </w:pPr>
-            <w:r>
-              <w:rPr/>
+              <w:spacing w:before="20" w:after="20" w:line="276" w:lineRule="auto"/>
+            </w:pPr>
+            <w:r/>
+            <w:r>
+              <w:rPr>
+                <w:rFonts w:ascii="Times New Roman" w:hAnsi="Times New Roman"/>
+                <w:b w:val="0"/>
+                <w:sz w:val="21"/>
+              </w:rPr>
+              <w:t>Нет (человеческий фактор, частые накладки)</w:t>
             </w:r>
           </w:p>
         </w:tc>
@@ -2511,16 +2437,16 @@
           </w:tcPr>
           <w:p>
             <w:pPr>
-              <w:pStyle w:val="Normal"/>
-              <w:keepNext w:val="true"/>
-              <w:bidi w:val="0"/>
-              <w:spacing w:lineRule="auto" w:line="240" w:before="0" w:after="0"/>
-              <w:ind w:hanging="0"/>
-              <w:jc w:val="start"/>
-              <w:rPr/>
-            </w:pPr>
-            <w:r>
-              <w:rPr/>
+              <w:spacing w:before="20" w:after="20" w:line="276" w:lineRule="auto"/>
+            </w:pPr>
+            <w:r/>
+            <w:r>
+              <w:rPr>
+                <w:rFonts w:ascii="Times New Roman" w:hAnsi="Times New Roman"/>
+                <w:b w:val="0"/>
+                <w:sz w:val="21"/>
+              </w:rPr>
+              <w:t>По описанию</w:t>
             </w:r>
           </w:p>
         </w:tc>
@@ -2542,16 +2468,16 @@
           </w:tcPr>
           <w:p>
             <w:pPr>
-              <w:pStyle w:val="Normal"/>
-              <w:keepNext w:val="true"/>
-              <w:bidi w:val="0"/>
-              <w:spacing w:lineRule="auto" w:line="240" w:before="0" w:after="0"/>
-              <w:ind w:hanging="0"/>
-              <w:jc w:val="start"/>
-              <w:rPr/>
-            </w:pPr>
-            <w:r>
-              <w:rPr/>
+              <w:spacing w:before="20" w:after="20" w:line="276" w:lineRule="auto"/>
+            </w:pPr>
+            <w:r/>
+            <w:r>
+              <w:rPr>
+                <w:rFonts w:ascii="Times New Roman" w:hAnsi="Times New Roman"/>
+                <w:b/>
+                <w:sz w:val="21"/>
+              </w:rPr>
+              <w:t>Защита схемы зала от удаления столов с активными бронями</w:t>
             </w:r>
           </w:p>
         </w:tc>
@@ -2567,16 +2493,16 @@
           </w:tcPr>
           <w:p>
             <w:pPr>
-              <w:pStyle w:val="Normal"/>
-              <w:keepNext w:val="true"/>
-              <w:bidi w:val="0"/>
-              <w:spacing w:lineRule="auto" w:line="240" w:before="0" w:after="0"/>
-              <w:ind w:hanging="0"/>
-              <w:jc w:val="start"/>
-              <w:rPr/>
-            </w:pPr>
-            <w:r>
-              <w:rPr/>
+              <w:spacing w:before="20" w:after="20" w:line="276" w:lineRule="auto"/>
+            </w:pPr>
+            <w:r/>
+            <w:r>
+              <w:rPr>
+                <w:rFonts w:ascii="Times New Roman" w:hAnsi="Times New Roman"/>
+                <w:b w:val="0"/>
+                <w:sz w:val="21"/>
+              </w:rPr>
+              <w:t>Частично (предупреждение)</w:t>
             </w:r>
           </w:p>
         </w:tc>
@@ -2592,16 +2518,16 @@
           </w:tcPr>
           <w:p>
             <w:pPr>
-              <w:pStyle w:val="Normal"/>
-              <w:keepNext w:val="true"/>
-              <w:bidi w:val="0"/>
-              <w:spacing w:lineRule="auto" w:line="240" w:before="0" w:after="0"/>
-              <w:ind w:hanging="0"/>
-              <w:jc w:val="start"/>
-              <w:rPr/>
-            </w:pPr>
-            <w:r>
-              <w:rPr/>
+              <w:spacing w:before="20" w:after="20" w:line="276" w:lineRule="auto"/>
+            </w:pPr>
+            <w:r/>
+            <w:r>
+              <w:rPr>
+                <w:rFonts w:ascii="Times New Roman" w:hAnsi="Times New Roman"/>
+                <w:b w:val="0"/>
+                <w:sz w:val="21"/>
+              </w:rPr>
+              <w:t>Есть (строгая блокировка изменений)</w:t>
             </w:r>
           </w:p>
         </w:tc>
@@ -2617,16 +2543,16 @@
           </w:tcPr>
           <w:p>
             <w:pPr>
-              <w:pStyle w:val="Normal"/>
-              <w:keepNext w:val="true"/>
-              <w:bidi w:val="0"/>
-              <w:spacing w:lineRule="auto" w:line="240" w:before="0" w:after="0"/>
-              <w:ind w:hanging="0"/>
-              <w:jc w:val="start"/>
-              <w:rPr/>
-            </w:pPr>
-            <w:r>
-              <w:rPr/>
+              <w:spacing w:before="20" w:after="20" w:line="276" w:lineRule="auto"/>
+            </w:pPr>
+            <w:r/>
+            <w:r>
+              <w:rPr>
+                <w:rFonts w:ascii="Times New Roman" w:hAnsi="Times New Roman"/>
+                <w:b w:val="0"/>
+                <w:sz w:val="21"/>
+              </w:rPr>
+              <w:t>Не применимо</w:t>
             </w:r>
           </w:p>
         </w:tc>
@@ -2642,16 +2568,16 @@
           </w:tcPr>
           <w:p>
             <w:pPr>
-              <w:pStyle w:val="Normal"/>
-              <w:keepNext w:val="true"/>
-              <w:bidi w:val="0"/>
-              <w:spacing w:lineRule="auto" w:line="240" w:before="0" w:after="0"/>
-              <w:ind w:hanging="0"/>
-              <w:jc w:val="start"/>
-              <w:rPr/>
-            </w:pPr>
-            <w:r>
-              <w:rPr/>
+              <w:spacing w:before="20" w:after="20" w:line="276" w:lineRule="auto"/>
+            </w:pPr>
+            <w:r/>
+            <w:r>
+              <w:rPr>
+                <w:rFonts w:ascii="Times New Roman" w:hAnsi="Times New Roman"/>
+                <w:b w:val="0"/>
+                <w:sz w:val="21"/>
+              </w:rPr>
+              <w:t>Нет (любые перестановки без системного контроля)</w:t>
             </w:r>
           </w:p>
         </w:tc>
@@ -2667,16 +2593,16 @@
           </w:tcPr>
           <w:p>
             <w:pPr>
-              <w:pStyle w:val="Normal"/>
-              <w:keepNext w:val="true"/>
-              <w:bidi w:val="0"/>
-              <w:spacing w:lineRule="auto" w:line="240" w:before="0" w:after="0"/>
-              <w:ind w:hanging="0"/>
-              <w:jc w:val="start"/>
-              <w:rPr/>
-            </w:pPr>
-            <w:r>
-              <w:rPr/>
+              <w:spacing w:before="20" w:after="20" w:line="276" w:lineRule="auto"/>
+            </w:pPr>
+            <w:r/>
+            <w:r>
+              <w:rPr>
+                <w:rFonts w:ascii="Times New Roman" w:hAnsi="Times New Roman"/>
+                <w:b w:val="0"/>
+                <w:sz w:val="21"/>
+              </w:rPr>
+              <w:t>По описанию</w:t>
             </w:r>
           </w:p>
         </w:tc>
@@ -2698,16 +2624,16 @@
           </w:tcPr>
           <w:p>
             <w:pPr>
-              <w:pStyle w:val="Normal"/>
-              <w:keepNext w:val="true"/>
-              <w:bidi w:val="0"/>
-              <w:spacing w:lineRule="auto" w:line="240" w:before="0" w:after="0"/>
-              <w:ind w:hanging="0"/>
-              <w:jc w:val="start"/>
-              <w:rPr/>
-            </w:pPr>
-            <w:r>
-              <w:rPr/>
+              <w:spacing w:before="20" w:after="20" w:line="276" w:lineRule="auto"/>
+            </w:pPr>
+            <w:r/>
+            <w:r>
+              <w:rPr>
+                <w:rFonts w:ascii="Times New Roman" w:hAnsi="Times New Roman"/>
+                <w:b/>
+                <w:sz w:val="21"/>
+              </w:rPr>
+              <w:t>Календарная шахматка броней для менеджера</w:t>
             </w:r>
           </w:p>
         </w:tc>
@@ -2723,16 +2649,16 @@
           </w:tcPr>
           <w:p>
             <w:pPr>
-              <w:pStyle w:val="Normal"/>
-              <w:keepNext w:val="true"/>
-              <w:bidi w:val="0"/>
-              <w:spacing w:lineRule="auto" w:line="240" w:before="0" w:after="0"/>
-              <w:ind w:hanging="0"/>
-              <w:jc w:val="start"/>
-              <w:rPr/>
-            </w:pPr>
-            <w:r>
-              <w:rPr/>
+              <w:spacing w:before="20" w:after="20" w:line="276" w:lineRule="auto"/>
+            </w:pPr>
+            <w:r/>
+            <w:r>
+              <w:rPr>
+                <w:rFonts w:ascii="Times New Roman" w:hAnsi="Times New Roman"/>
+                <w:b w:val="0"/>
+                <w:sz w:val="21"/>
+              </w:rPr>
+              <w:t>Есть (в ЛК заведения)</w:t>
             </w:r>
           </w:p>
         </w:tc>
@@ -2748,16 +2674,16 @@
           </w:tcPr>
           <w:p>
             <w:pPr>
-              <w:pStyle w:val="Normal"/>
-              <w:keepNext w:val="true"/>
-              <w:bidi w:val="0"/>
-              <w:spacing w:lineRule="auto" w:line="240" w:before="0" w:after="0"/>
-              <w:ind w:hanging="0"/>
-              <w:jc w:val="start"/>
-              <w:rPr/>
-            </w:pPr>
-            <w:r>
-              <w:rPr/>
+              <w:spacing w:before="20" w:after="20" w:line="276" w:lineRule="auto"/>
+            </w:pPr>
+            <w:r/>
+            <w:r>
+              <w:rPr>
+                <w:rFonts w:ascii="Times New Roman" w:hAnsi="Times New Roman"/>
+                <w:b w:val="0"/>
+                <w:sz w:val="21"/>
+              </w:rPr>
+              <w:t>Есть (основной экран системы)</w:t>
             </w:r>
           </w:p>
         </w:tc>
@@ -2773,16 +2699,16 @@
           </w:tcPr>
           <w:p>
             <w:pPr>
-              <w:pStyle w:val="Normal"/>
-              <w:keepNext w:val="true"/>
-              <w:bidi w:val="0"/>
-              <w:spacing w:lineRule="auto" w:line="240" w:before="0" w:after="0"/>
-              <w:ind w:hanging="0"/>
-              <w:jc w:val="start"/>
-              <w:rPr/>
-            </w:pPr>
-            <w:r>
-              <w:rPr/>
+              <w:spacing w:before="20" w:after="20" w:line="276" w:lineRule="auto"/>
+            </w:pPr>
+            <w:r/>
+            <w:r>
+              <w:rPr>
+                <w:rFonts w:ascii="Times New Roman" w:hAnsi="Times New Roman"/>
+                <w:b w:val="0"/>
+                <w:sz w:val="21"/>
+              </w:rPr>
+              <w:t>Есть (базовый список броней для партнера)</w:t>
             </w:r>
           </w:p>
         </w:tc>
@@ -2798,16 +2724,16 @@
           </w:tcPr>
           <w:p>
             <w:pPr>
-              <w:pStyle w:val="Normal"/>
-              <w:keepNext w:val="true"/>
-              <w:bidi w:val="0"/>
-              <w:spacing w:lineRule="auto" w:line="240" w:before="0" w:after="0"/>
-              <w:ind w:hanging="0"/>
-              <w:jc w:val="start"/>
-              <w:rPr/>
-            </w:pPr>
-            <w:r>
-              <w:rPr/>
+              <w:spacing w:before="20" w:after="20" w:line="276" w:lineRule="auto"/>
+            </w:pPr>
+            <w:r/>
+            <w:r>
+              <w:rPr>
+                <w:rFonts w:ascii="Times New Roman" w:hAnsi="Times New Roman"/>
+                <w:b w:val="0"/>
+                <w:sz w:val="21"/>
+              </w:rPr>
+              <w:t>Нет (ручные записи в бумажную тетрадь)</w:t>
             </w:r>
           </w:p>
         </w:tc>
@@ -2823,16 +2749,16 @@
           </w:tcPr>
           <w:p>
             <w:pPr>
-              <w:pStyle w:val="Normal"/>
-              <w:keepNext w:val="true"/>
-              <w:bidi w:val="0"/>
-              <w:spacing w:lineRule="auto" w:line="240" w:before="0" w:after="0"/>
-              <w:ind w:hanging="0"/>
-              <w:jc w:val="start"/>
-              <w:rPr/>
-            </w:pPr>
-            <w:r>
-              <w:rPr/>
+              <w:spacing w:before="20" w:after="20" w:line="276" w:lineRule="auto"/>
+            </w:pPr>
+            <w:r/>
+            <w:r>
+              <w:rPr>
+                <w:rFonts w:ascii="Times New Roman" w:hAnsi="Times New Roman"/>
+                <w:b w:val="0"/>
+                <w:sz w:val="21"/>
+              </w:rPr>
+              <w:t>Проверено лично</w:t>
             </w:r>
           </w:p>
         </w:tc>
@@ -2854,15 +2780,16 @@
           </w:tcPr>
           <w:p>
             <w:pPr>
-              <w:pStyle w:val="Normal"/>
-              <w:bidi w:val="0"/>
-              <w:spacing w:lineRule="auto" w:line="240" w:before="0" w:after="0"/>
-              <w:ind w:hanging="0"/>
-              <w:jc w:val="start"/>
-              <w:rPr/>
-            </w:pPr>
-            <w:r>
-              <w:rPr/>
+              <w:spacing w:before="20" w:after="20" w:line="276" w:lineRule="auto"/>
+            </w:pPr>
+            <w:r/>
+            <w:r>
+              <w:rPr>
+                <w:rFonts w:ascii="Times New Roman" w:hAnsi="Times New Roman"/>
+                <w:b/>
+                <w:sz w:val="21"/>
+              </w:rPr>
+              <w:t>Возможность бронирования стола без звонка в ресторан</w:t>
             </w:r>
           </w:p>
         </w:tc>
@@ -2878,15 +2805,16 @@
           </w:tcPr>
           <w:p>
             <w:pPr>
-              <w:pStyle w:val="Normal"/>
-              <w:bidi w:val="0"/>
-              <w:spacing w:lineRule="auto" w:line="240" w:before="0" w:after="0"/>
-              <w:ind w:hanging="0"/>
-              <w:jc w:val="start"/>
-              <w:rPr/>
-            </w:pPr>
-            <w:r>
-              <w:rPr/>
+              <w:spacing w:before="20" w:after="20" w:line="276" w:lineRule="auto"/>
+            </w:pPr>
+            <w:r/>
+            <w:r>
+              <w:rPr>
+                <w:rFonts w:ascii="Times New Roman" w:hAnsi="Times New Roman"/>
+                <w:b w:val="0"/>
+                <w:sz w:val="21"/>
+              </w:rPr>
+              <w:t>Да (онлайн 24/7)</w:t>
             </w:r>
           </w:p>
         </w:tc>
@@ -2902,15 +2830,16 @@
           </w:tcPr>
           <w:p>
             <w:pPr>
-              <w:pStyle w:val="Normal"/>
-              <w:bidi w:val="0"/>
-              <w:spacing w:lineRule="auto" w:line="240" w:before="0" w:after="0"/>
-              <w:ind w:hanging="0"/>
-              <w:jc w:val="start"/>
-              <w:rPr/>
-            </w:pPr>
-            <w:r>
-              <w:rPr/>
+              <w:spacing w:before="20" w:after="20" w:line="276" w:lineRule="auto"/>
+            </w:pPr>
+            <w:r/>
+            <w:r>
+              <w:rPr>
+                <w:rFonts w:ascii="Times New Roman" w:hAnsi="Times New Roman"/>
+                <w:b w:val="0"/>
+                <w:sz w:val="21"/>
+              </w:rPr>
+              <w:t>Да (онлайн 24/7)</w:t>
             </w:r>
           </w:p>
         </w:tc>
@@ -2926,15 +2855,16 @@
           </w:tcPr>
           <w:p>
             <w:pPr>
-              <w:pStyle w:val="Normal"/>
-              <w:bidi w:val="0"/>
-              <w:spacing w:lineRule="auto" w:line="240" w:before="0" w:after="0"/>
-              <w:ind w:hanging="0"/>
-              <w:jc w:val="start"/>
-              <w:rPr/>
-            </w:pPr>
-            <w:r>
-              <w:rPr/>
+              <w:spacing w:before="20" w:after="20" w:line="276" w:lineRule="auto"/>
+            </w:pPr>
+            <w:r/>
+            <w:r>
+              <w:rPr>
+                <w:rFonts w:ascii="Times New Roman" w:hAnsi="Times New Roman"/>
+                <w:b w:val="0"/>
+                <w:sz w:val="21"/>
+              </w:rPr>
+              <w:t>Да (онлайн 24/7)</w:t>
             </w:r>
           </w:p>
         </w:tc>
@@ -2950,15 +2880,16 @@
           </w:tcPr>
           <w:p>
             <w:pPr>
-              <w:pStyle w:val="Normal"/>
-              <w:bidi w:val="0"/>
-              <w:spacing w:lineRule="auto" w:line="240" w:before="0" w:after="0"/>
-              <w:ind w:hanging="0"/>
-              <w:jc w:val="start"/>
-              <w:rPr/>
-            </w:pPr>
-            <w:r>
-              <w:rPr/>
+              <w:spacing w:before="20" w:after="20" w:line="276" w:lineRule="auto"/>
+            </w:pPr>
+            <w:r/>
+            <w:r>
+              <w:rPr>
+                <w:rFonts w:ascii="Times New Roman" w:hAnsi="Times New Roman"/>
+                <w:b w:val="0"/>
+                <w:sz w:val="21"/>
+              </w:rPr>
+              <w:t>Нет (строго звонок в рабочие часы заведения)</w:t>
             </w:r>
           </w:p>
         </w:tc>
@@ -2974,15 +2905,16 @@
           </w:tcPr>
           <w:p>
             <w:pPr>
-              <w:pStyle w:val="Normal"/>
-              <w:bidi w:val="0"/>
-              <w:spacing w:lineRule="auto" w:line="240" w:before="0" w:after="0"/>
-              <w:ind w:hanging="0"/>
-              <w:jc w:val="start"/>
-              <w:rPr/>
-            </w:pPr>
-            <w:r>
-              <w:rPr/>
+              <w:spacing w:before="20" w:after="20" w:line="276" w:lineRule="auto"/>
+            </w:pPr>
+            <w:r/>
+            <w:r>
+              <w:rPr>
+                <w:rFonts w:ascii="Times New Roman" w:hAnsi="Times New Roman"/>
+                <w:b w:val="0"/>
+                <w:sz w:val="21"/>
+              </w:rPr>
+              <w:t>Проверено лично</w:t>
             </w:r>
           </w:p>
         </w:tc>
@@ -3201,20 +3133,16 @@
           </w:tcPr>
           <w:p>
             <w:pPr>
-              <w:pStyle w:val="Normal"/>
-              <w:keepNext w:val="true"/>
-              <w:bidi w:val="0"/>
-              <w:spacing w:lineRule="auto" w:line="240" w:before="0" w:after="0"/>
-              <w:ind w:hanging="0"/>
-              <w:jc w:val="start"/>
-              <w:rPr/>
-            </w:pPr>
-            <w:r>
-              <w:rPr>
-                <w:rFonts w:ascii="Times New Roman" w:hAnsi="Times New Roman"/>
-                <w:sz w:val="24"/>
-              </w:rPr>
-              <w:t>1</w:t>
+              <w:spacing w:before="20" w:after="20" w:line="276" w:lineRule="auto"/>
+            </w:pPr>
+            <w:r/>
+            <w:r>
+              <w:rPr>
+                <w:rFonts w:ascii="Times New Roman" w:hAnsi="Times New Roman"/>
+                <w:b/>
+                <w:sz w:val="21"/>
+              </w:rPr>
+              <w:t>1 (Restoplace)</w:t>
             </w:r>
           </w:p>
         </w:tc>
@@ -3230,16 +3158,16 @@
           </w:tcPr>
           <w:p>
             <w:pPr>
-              <w:pStyle w:val="Normal"/>
-              <w:keepNext w:val="true"/>
-              <w:bidi w:val="0"/>
-              <w:spacing w:lineRule="auto" w:line="240" w:before="0" w:after="0"/>
-              <w:ind w:hanging="0"/>
-              <w:jc w:val="start"/>
-              <w:rPr/>
-            </w:pPr>
-            <w:r>
-              <w:rPr/>
+              <w:spacing w:before="20" w:after="20" w:line="276" w:lineRule="auto"/>
+            </w:pPr>
+            <w:r/>
+            <w:r>
+              <w:rPr>
+                <w:rFonts w:ascii="Times New Roman" w:hAnsi="Times New Roman"/>
+                <w:b w:val="0"/>
+                <w:sz w:val="21"/>
+              </w:rPr>
+              <w:t>Наглядный 2D-конструктор залов, удобный виджет онлайн-бронирования для гостей, подсветка столов цветом.</w:t>
             </w:r>
           </w:p>
         </w:tc>
@@ -3255,16 +3183,16 @@
           </w:tcPr>
           <w:p>
             <w:pPr>
-              <w:pStyle w:val="Normal"/>
-              <w:keepNext w:val="true"/>
-              <w:bidi w:val="0"/>
-              <w:spacing w:lineRule="auto" w:line="240" w:before="0" w:after="0"/>
-              <w:ind w:hanging="0"/>
-              <w:jc w:val="start"/>
-              <w:rPr/>
-            </w:pPr>
-            <w:r>
-              <w:rPr/>
+              <w:spacing w:before="20" w:after="20" w:line="276" w:lineRule="auto"/>
+            </w:pPr>
+            <w:r/>
+            <w:r>
+              <w:rPr>
+                <w:rFonts w:ascii="Times New Roman" w:hAnsi="Times New Roman"/>
+                <w:b w:val="0"/>
+                <w:sz w:val="21"/>
+              </w:rPr>
+              <w:t>Закрытая коммерческая платформа, жесткие тарифы, перегруженность маркетинговыми инструментами.</w:t>
             </w:r>
           </w:p>
         </w:tc>
@@ -3280,16 +3208,16 @@
           </w:tcPr>
           <w:p>
             <w:pPr>
-              <w:pStyle w:val="Normal"/>
-              <w:keepNext w:val="true"/>
-              <w:bidi w:val="0"/>
-              <w:spacing w:lineRule="auto" w:line="240" w:before="0" w:after="0"/>
-              <w:ind w:hanging="0"/>
-              <w:jc w:val="start"/>
-              <w:rPr/>
-            </w:pPr>
-            <w:r>
-              <w:rPr/>
+              <w:spacing w:before="20" w:after="20" w:line="276" w:lineRule="auto"/>
+            </w:pPr>
+            <w:r/>
+            <w:r>
+              <w:rPr>
+                <w:rFonts w:ascii="Times New Roman" w:hAnsi="Times New Roman"/>
+                <w:b w:val="0"/>
+                <w:sz w:val="21"/>
+              </w:rPr>
+              <w:t>Концепция интерактивной 2D-схемы зала с зонами и столами, подсветка доступности столов цветом на выбранный слот.</w:t>
             </w:r>
           </w:p>
         </w:tc>
@@ -3305,16 +3233,16 @@
           </w:tcPr>
           <w:p>
             <w:pPr>
-              <w:pStyle w:val="Normal"/>
-              <w:keepNext w:val="true"/>
-              <w:bidi w:val="0"/>
-              <w:spacing w:lineRule="auto" w:line="240" w:before="0" w:after="0"/>
-              <w:ind w:hanging="0"/>
-              <w:jc w:val="start"/>
-              <w:rPr/>
-            </w:pPr>
-            <w:r>
-              <w:rPr/>
+              <w:spacing w:before="20" w:after="20" w:line="276" w:lineRule="auto"/>
+            </w:pPr>
+            <w:r/>
+            <w:r>
+              <w:rPr>
+                <w:rFonts w:ascii="Times New Roman" w:hAnsi="Times New Roman"/>
+                <w:b w:val="0"/>
+                <w:sz w:val="21"/>
+              </w:rPr>
+              <w:t>Платные рассылки, депозиты, навязчивые модули допродаж блюд.</w:t>
             </w:r>
           </w:p>
         </w:tc>
@@ -3336,20 +3264,16 @@
           </w:tcPr>
           <w:p>
             <w:pPr>
-              <w:pStyle w:val="Normal"/>
-              <w:keepNext w:val="true"/>
-              <w:bidi w:val="0"/>
-              <w:spacing w:lineRule="auto" w:line="240" w:before="0" w:after="0"/>
-              <w:ind w:hanging="0"/>
-              <w:jc w:val="start"/>
-              <w:rPr/>
-            </w:pPr>
-            <w:r>
-              <w:rPr>
-                <w:rFonts w:ascii="Times New Roman" w:hAnsi="Times New Roman"/>
-                <w:sz w:val="24"/>
-              </w:rPr>
-              <w:t>2</w:t>
+              <w:spacing w:before="20" w:after="20" w:line="276" w:lineRule="auto"/>
+            </w:pPr>
+            <w:r/>
+            <w:r>
+              <w:rPr>
+                <w:rFonts w:ascii="Times New Roman" w:hAnsi="Times New Roman"/>
+                <w:b/>
+                <w:sz w:val="21"/>
+              </w:rPr>
+              <w:t>2 (OpenTable)</w:t>
             </w:r>
           </w:p>
         </w:tc>
@@ -3365,16 +3289,16 @@
           </w:tcPr>
           <w:p>
             <w:pPr>
-              <w:pStyle w:val="Normal"/>
-              <w:keepNext w:val="true"/>
-              <w:bidi w:val="0"/>
-              <w:spacing w:lineRule="auto" w:line="240" w:before="0" w:after="0"/>
-              <w:ind w:hanging="0"/>
-              <w:jc w:val="start"/>
-              <w:rPr/>
-            </w:pPr>
-            <w:r>
-              <w:rPr/>
+              <w:spacing w:before="20" w:after="20" w:line="276" w:lineRule="auto"/>
+            </w:pPr>
+            <w:r/>
+            <w:r>
+              <w:rPr>
+                <w:rFonts w:ascii="Times New Roman" w:hAnsi="Times New Roman"/>
+                <w:b w:val="0"/>
+                <w:sz w:val="21"/>
+              </w:rPr>
+              <w:t>Мировой стандарт управления залом, детальная шахматка броней, учет статусов посадки и неявки (no-show).</w:t>
             </w:r>
           </w:p>
         </w:tc>
@@ -3390,16 +3314,16 @@
           </w:tcPr>
           <w:p>
             <w:pPr>
-              <w:pStyle w:val="Normal"/>
-              <w:keepNext w:val="true"/>
-              <w:bidi w:val="0"/>
-              <w:spacing w:lineRule="auto" w:line="240" w:before="0" w:after="0"/>
-              <w:ind w:hanging="0"/>
-              <w:jc w:val="start"/>
-              <w:rPr/>
-            </w:pPr>
-            <w:r>
-              <w:rPr/>
+              <w:spacing w:before="20" w:after="20" w:line="276" w:lineRule="auto"/>
+            </w:pPr>
+            <w:r/>
+            <w:r>
+              <w:rPr>
+                <w:rFonts w:ascii="Times New Roman" w:hAnsi="Times New Roman"/>
+                <w:b w:val="0"/>
+                <w:sz w:val="21"/>
+              </w:rPr>
+              <w:t>Высокая сложность и громоздкость интерфейса, ориентация на сетевые рестораны и рынок США.</w:t>
             </w:r>
           </w:p>
         </w:tc>
@@ -3415,16 +3339,16 @@
           </w:tcPr>
           <w:p>
             <w:pPr>
-              <w:pStyle w:val="Normal"/>
-              <w:keepNext w:val="true"/>
-              <w:bidi w:val="0"/>
-              <w:spacing w:lineRule="auto" w:line="240" w:before="0" w:after="0"/>
-              <w:ind w:hanging="0"/>
-              <w:jc w:val="start"/>
-              <w:rPr/>
-            </w:pPr>
-            <w:r>
-              <w:rPr/>
+              <w:spacing w:before="20" w:after="20" w:line="276" w:lineRule="auto"/>
+            </w:pPr>
+            <w:r/>
+            <w:r>
+              <w:rPr>
+                <w:rFonts w:ascii="Times New Roman" w:hAnsi="Times New Roman"/>
+                <w:b w:val="0"/>
+                <w:sz w:val="21"/>
+              </w:rPr>
+              <w:t>Журнал бронирований для хостес/менеджера, статусы бронирования (confirmed, completed, cancelled, no-show).</w:t>
             </w:r>
           </w:p>
         </w:tc>
@@ -3440,16 +3364,16 @@
           </w:tcPr>
           <w:p>
             <w:pPr>
-              <w:pStyle w:val="Normal"/>
-              <w:keepNext w:val="true"/>
-              <w:bidi w:val="0"/>
-              <w:spacing w:lineRule="auto" w:line="240" w:before="0" w:after="0"/>
-              <w:ind w:hanging="0"/>
-              <w:jc w:val="start"/>
-              <w:rPr/>
-            </w:pPr>
-            <w:r>
-              <w:rPr/>
+              <w:spacing w:before="20" w:after="20" w:line="276" w:lineRule="auto"/>
+            </w:pPr>
+            <w:r/>
+            <w:r>
+              <w:rPr>
+                <w:rFonts w:ascii="Times New Roman" w:hAnsi="Times New Roman"/>
+                <w:b w:val="0"/>
+                <w:sz w:val="21"/>
+              </w:rPr>
+              <w:t>Сложные интеграции с зарубежными кассовыми POS-системами, учет рабочих смен официантов.</w:t>
             </w:r>
           </w:p>
         </w:tc>
@@ -3471,20 +3395,16 @@
           </w:tcPr>
           <w:p>
             <w:pPr>
-              <w:pStyle w:val="Normal"/>
-              <w:keepNext w:val="true"/>
-              <w:bidi w:val="0"/>
-              <w:spacing w:lineRule="auto" w:line="240" w:before="0" w:after="0"/>
-              <w:ind w:hanging="0"/>
-              <w:jc w:val="start"/>
-              <w:rPr/>
-            </w:pPr>
-            <w:r>
-              <w:rPr>
-                <w:rFonts w:ascii="Times New Roman" w:hAnsi="Times New Roman"/>
-                <w:sz w:val="24"/>
-              </w:rPr>
-              <w:t>3</w:t>
+              <w:spacing w:before="20" w:after="20" w:line="276" w:lineRule="auto"/>
+            </w:pPr>
+            <w:r/>
+            <w:r>
+              <w:rPr>
+                <w:rFonts w:ascii="Times New Roman" w:hAnsi="Times New Roman"/>
+                <w:b/>
+                <w:sz w:val="21"/>
+              </w:rPr>
+              <w:t>3 (Яндекс Карты)</w:t>
             </w:r>
           </w:p>
         </w:tc>
@@ -3500,16 +3420,16 @@
           </w:tcPr>
           <w:p>
             <w:pPr>
-              <w:pStyle w:val="Normal"/>
-              <w:keepNext w:val="true"/>
-              <w:bidi w:val="0"/>
-              <w:spacing w:lineRule="auto" w:line="240" w:before="0" w:after="0"/>
-              <w:ind w:hanging="0"/>
-              <w:jc w:val="start"/>
-              <w:rPr/>
-            </w:pPr>
-            <w:r>
-              <w:rPr/>
+              <w:spacing w:before="20" w:after="20" w:line="276" w:lineRule="auto"/>
+            </w:pPr>
+            <w:r/>
+            <w:r>
+              <w:rPr>
+                <w:rFonts w:ascii="Times New Roman" w:hAnsi="Times New Roman"/>
+                <w:b w:val="0"/>
+                <w:sz w:val="21"/>
+              </w:rPr>
+              <w:t>Огромная база пользователей, максимальная простота и узнаваемость UX подбора времени и гостей.</w:t>
             </w:r>
           </w:p>
         </w:tc>
@@ -3525,16 +3445,16 @@
           </w:tcPr>
           <w:p>
             <w:pPr>
-              <w:pStyle w:val="Normal"/>
-              <w:keepNext w:val="true"/>
-              <w:bidi w:val="0"/>
-              <w:spacing w:lineRule="auto" w:line="240" w:before="0" w:after="0"/>
-              <w:ind w:hanging="0"/>
-              <w:jc w:val="start"/>
-              <w:rPr/>
-            </w:pPr>
-            <w:r>
-              <w:rPr/>
+              <w:spacing w:before="20" w:after="20" w:line="276" w:lineRule="auto"/>
+            </w:pPr>
+            <w:r/>
+            <w:r>
+              <w:rPr>
+                <w:rFonts w:ascii="Times New Roman" w:hAnsi="Times New Roman"/>
+                <w:b w:val="0"/>
+                <w:sz w:val="21"/>
+              </w:rPr>
+              <w:t>Бронирование «вслепую» (без интерактивной карты зала и выбора стола), зависимость заведения от экосистемы.</w:t>
             </w:r>
           </w:p>
         </w:tc>
@@ -3550,16 +3470,16 @@
           </w:tcPr>
           <w:p>
             <w:pPr>
-              <w:pStyle w:val="Normal"/>
-              <w:keepNext w:val="true"/>
-              <w:bidi w:val="0"/>
-              <w:spacing w:lineRule="auto" w:line="240" w:before="0" w:after="0"/>
-              <w:ind w:hanging="0"/>
-              <w:jc w:val="start"/>
-              <w:rPr/>
-            </w:pPr>
-            <w:r>
-              <w:rPr/>
+              <w:spacing w:before="20" w:after="20" w:line="276" w:lineRule="auto"/>
+            </w:pPr>
+            <w:r/>
+            <w:r>
+              <w:rPr>
+                <w:rFonts w:ascii="Times New Roman" w:hAnsi="Times New Roman"/>
+                <w:b w:val="0"/>
+                <w:sz w:val="21"/>
+              </w:rPr>
+              <w:t>Простой и лаконичный пошаговый UX: дата -&gt; время -&gt; число гостей -&gt; подтверждение контактов.</w:t>
             </w:r>
           </w:p>
         </w:tc>
@@ -3575,16 +3495,16 @@
           </w:tcPr>
           <w:p>
             <w:pPr>
-              <w:pStyle w:val="Normal"/>
-              <w:keepNext w:val="true"/>
-              <w:bidi w:val="0"/>
-              <w:spacing w:lineRule="auto" w:line="240" w:before="0" w:after="0"/>
-              <w:ind w:hanging="0"/>
-              <w:jc w:val="start"/>
-              <w:rPr/>
-            </w:pPr>
-            <w:r>
-              <w:rPr/>
+              <w:spacing w:before="20" w:after="20" w:line="276" w:lineRule="auto"/>
+            </w:pPr>
+            <w:r/>
+            <w:r>
+              <w:rPr>
+                <w:rFonts w:ascii="Times New Roman" w:hAnsi="Times New Roman"/>
+                <w:b w:val="0"/>
+                <w:sz w:val="21"/>
+              </w:rPr>
+              <w:t>Бронирование без возможности увидеть и выбрать конкретное посадочное место на схеме.</w:t>
             </w:r>
           </w:p>
         </w:tc>
@@ -3606,20 +3526,16 @@
           </w:tcPr>
           <w:p>
             <w:pPr>
-              <w:pStyle w:val="Normal"/>
-              <w:keepNext w:val="true"/>
-              <w:bidi w:val="0"/>
-              <w:spacing w:lineRule="auto" w:line="240" w:before="0" w:after="0"/>
-              <w:ind w:hanging="0"/>
-              <w:jc w:val="start"/>
-              <w:rPr/>
-            </w:pPr>
-            <w:r>
-              <w:rPr>
-                <w:rFonts w:ascii="Times New Roman" w:hAnsi="Times New Roman"/>
-                <w:sz w:val="24"/>
-              </w:rPr>
-              <w:t>4</w:t>
+              <w:spacing w:before="20" w:after="20" w:line="276" w:lineRule="auto"/>
+            </w:pPr>
+            <w:r/>
+            <w:r>
+              <w:rPr>
+                <w:rFonts w:ascii="Times New Roman" w:hAnsi="Times New Roman"/>
+                <w:b/>
+                <w:sz w:val="21"/>
+              </w:rPr>
+              <w:t>4 (Текущий способ: журнал / звонки)</w:t>
             </w:r>
           </w:p>
         </w:tc>
@@ -3635,16 +3551,16 @@
           </w:tcPr>
           <w:p>
             <w:pPr>
-              <w:pStyle w:val="Normal"/>
-              <w:keepNext w:val="true"/>
-              <w:bidi w:val="0"/>
-              <w:spacing w:lineRule="auto" w:line="240" w:before="0" w:after="0"/>
-              <w:ind w:hanging="0"/>
-              <w:jc w:val="start"/>
-              <w:rPr/>
-            </w:pPr>
-            <w:r>
-              <w:rPr/>
+              <w:spacing w:before="20" w:after="20" w:line="276" w:lineRule="auto"/>
+            </w:pPr>
+            <w:r/>
+            <w:r>
+              <w:rPr>
+                <w:rFonts w:ascii="Times New Roman" w:hAnsi="Times New Roman"/>
+                <w:b w:val="0"/>
+                <w:sz w:val="21"/>
+              </w:rPr>
+              <w:t>Нулевая стоимость внедрения, привычность для персонала, полная автономность от наличия интернета.</w:t>
             </w:r>
           </w:p>
         </w:tc>
@@ -3660,16 +3576,16 @@
           </w:tcPr>
           <w:p>
             <w:pPr>
-              <w:pStyle w:val="Normal"/>
-              <w:keepNext w:val="true"/>
-              <w:bidi w:val="0"/>
-              <w:spacing w:lineRule="auto" w:line="240" w:before="0" w:after="0"/>
-              <w:ind w:hanging="0"/>
-              <w:jc w:val="start"/>
-              <w:rPr/>
-            </w:pPr>
-            <w:r>
-              <w:rPr/>
+              <w:spacing w:before="20" w:after="20" w:line="276" w:lineRule="auto"/>
+            </w:pPr>
+            <w:r/>
+            <w:r>
+              <w:rPr>
+                <w:rFonts w:ascii="Times New Roman" w:hAnsi="Times New Roman"/>
+                <w:b w:val="0"/>
+                <w:sz w:val="21"/>
+              </w:rPr>
+              <w:t>Человеческий фактор, частый овербукинг, потеря броней, гость не видит зал, невозможность брони 24/7.</w:t>
             </w:r>
           </w:p>
         </w:tc>
@@ -3685,16 +3601,16 @@
           </w:tcPr>
           <w:p>
             <w:pPr>
-              <w:pStyle w:val="Normal"/>
-              <w:keepNext w:val="true"/>
-              <w:bidi w:val="0"/>
-              <w:spacing w:lineRule="auto" w:line="240" w:before="0" w:after="0"/>
-              <w:ind w:hanging="0"/>
-              <w:jc w:val="start"/>
-              <w:rPr/>
-            </w:pPr>
-            <w:r>
-              <w:rPr/>
+              <w:spacing w:before="20" w:after="20" w:line="276" w:lineRule="auto"/>
+            </w:pPr>
+            <w:r/>
+            <w:r>
+              <w:rPr>
+                <w:rFonts w:ascii="Times New Roman" w:hAnsi="Times New Roman"/>
+                <w:b w:val="0"/>
+                <w:sz w:val="21"/>
+              </w:rPr>
+              <w:t>Понимание ключевых болей персонала и гостей, логика индивидуальных заметок к бронированию («у окна», «детский стул»).</w:t>
             </w:r>
           </w:p>
         </w:tc>
@@ -3710,16 +3626,16 @@
           </w:tcPr>
           <w:p>
             <w:pPr>
-              <w:pStyle w:val="Normal"/>
-              <w:keepNext w:val="true"/>
-              <w:bidi w:val="0"/>
-              <w:spacing w:lineRule="auto" w:line="240" w:before="0" w:after="0"/>
-              <w:ind w:hanging="0"/>
-              <w:jc w:val="start"/>
-              <w:rPr/>
-            </w:pPr>
-            <w:r>
-              <w:rPr/>
+              <w:spacing w:before="20" w:after="20" w:line="276" w:lineRule="auto"/>
+            </w:pPr>
+            <w:r/>
+            <w:r>
+              <w:rPr>
+                <w:rFonts w:ascii="Times New Roman" w:hAnsi="Times New Roman"/>
+                <w:b w:val="0"/>
+                <w:sz w:val="21"/>
+              </w:rPr>
+              <w:t>Отсутствие оцифровки данных и ручной бумажный учет.</w:t>
             </w:r>
           </w:p>
         </w:tc>
@@ -3741,19 +3657,16 @@
           </w:tcPr>
           <w:p>
             <w:pPr>
-              <w:pStyle w:val="Normal"/>
-              <w:bidi w:val="0"/>
-              <w:spacing w:lineRule="auto" w:line="240" w:before="0" w:after="0"/>
-              <w:ind w:hanging="0"/>
-              <w:jc w:val="start"/>
-              <w:rPr/>
-            </w:pPr>
-            <w:r>
-              <w:rPr>
-                <w:rFonts w:ascii="Times New Roman" w:hAnsi="Times New Roman"/>
-                <w:sz w:val="24"/>
-              </w:rPr>
-              <w:t>5</w:t>
+              <w:spacing w:before="20" w:after="20" w:line="276" w:lineRule="auto"/>
+            </w:pPr>
+            <w:r/>
+            <w:r>
+              <w:rPr>
+                <w:rFonts w:ascii="Times New Roman" w:hAnsi="Times New Roman"/>
+                <w:b/>
+                <w:sz w:val="21"/>
+              </w:rPr>
+              <w:t>5 (Floorplanner - референс)</w:t>
             </w:r>
           </w:p>
         </w:tc>
@@ -3769,15 +3682,16 @@
           </w:tcPr>
           <w:p>
             <w:pPr>
-              <w:pStyle w:val="Normal"/>
-              <w:bidi w:val="0"/>
-              <w:spacing w:lineRule="auto" w:line="240" w:before="0" w:after="0"/>
-              <w:ind w:hanging="0"/>
-              <w:jc w:val="start"/>
-              <w:rPr/>
-            </w:pPr>
-            <w:r>
-              <w:rPr/>
+              <w:spacing w:before="20" w:after="20" w:line="276" w:lineRule="auto"/>
+            </w:pPr>
+            <w:r/>
+            <w:r>
+              <w:rPr>
+                <w:rFonts w:ascii="Times New Roman" w:hAnsi="Times New Roman"/>
+                <w:b w:val="0"/>
+                <w:sz w:val="21"/>
+              </w:rPr>
+              <w:t>Идеальная эргономика 2D-веб-редактора: плавный drag-and-drop, сетка с привязкой, свободное вращение объектов.</w:t>
             </w:r>
           </w:p>
         </w:tc>
@@ -3793,15 +3707,16 @@
           </w:tcPr>
           <w:p>
             <w:pPr>
-              <w:pStyle w:val="Normal"/>
-              <w:bidi w:val="0"/>
-              <w:spacing w:lineRule="auto" w:line="240" w:before="0" w:after="0"/>
-              <w:ind w:hanging="0"/>
-              <w:jc w:val="start"/>
-              <w:rPr/>
-            </w:pPr>
-            <w:r>
-              <w:rPr/>
+              <w:spacing w:before="20" w:after="20" w:line="276" w:lineRule="auto"/>
+            </w:pPr>
+            <w:r/>
+            <w:r>
+              <w:rPr>
+                <w:rFonts w:ascii="Times New Roman" w:hAnsi="Times New Roman"/>
+                <w:b w:val="0"/>
+                <w:sz w:val="21"/>
+              </w:rPr>
+              <w:t>Избыточный архитектурный CAD-функционал (материалы, толщина стен, 3D), оторванность от ресторанного бизнеса.</w:t>
             </w:r>
           </w:p>
         </w:tc>
@@ -3817,15 +3732,16 @@
           </w:tcPr>
           <w:p>
             <w:pPr>
-              <w:pStyle w:val="Normal"/>
-              <w:bidi w:val="0"/>
-              <w:spacing w:lineRule="auto" w:line="240" w:before="0" w:after="0"/>
-              <w:ind w:hanging="0"/>
-              <w:jc w:val="start"/>
-              <w:rPr/>
-            </w:pPr>
-            <w:r>
-              <w:rPr/>
+              <w:spacing w:before="20" w:after="20" w:line="276" w:lineRule="auto"/>
+            </w:pPr>
+            <w:r/>
+            <w:r>
+              <w:rPr>
+                <w:rFonts w:ascii="Times New Roman" w:hAnsi="Times New Roman"/>
+                <w:b w:val="0"/>
+                <w:sz w:val="21"/>
+              </w:rPr>
+              <w:t>Механика манипуляции объектами на холсте (столы, полигоны зон, вращение, привязка к координатной сетке).</w:t>
             </w:r>
           </w:p>
         </w:tc>
@@ -3841,15 +3757,16 @@
           </w:tcPr>
           <w:p>
             <w:pPr>
-              <w:pStyle w:val="Normal"/>
-              <w:bidi w:val="0"/>
-              <w:spacing w:lineRule="auto" w:line="240" w:before="0" w:after="0"/>
-              <w:ind w:hanging="0"/>
-              <w:jc w:val="start"/>
-              <w:rPr/>
-            </w:pPr>
-            <w:r>
-              <w:rPr/>
+              <w:spacing w:before="20" w:after="20" w:line="276" w:lineRule="auto"/>
+            </w:pPr>
+            <w:r/>
+            <w:r>
+              <w:rPr>
+                <w:rFonts w:ascii="Times New Roman" w:hAnsi="Times New Roman"/>
+                <w:b w:val="0"/>
+                <w:sz w:val="21"/>
+              </w:rPr>
+              <w:t>Сложный архитектурный 3D-рендер и строительные слои.</w:t>
             </w:r>
           </w:p>
         </w:tc>
@@ -4006,18 +3923,14 @@
           </w:tcPr>
           <w:p>
             <w:pPr>
-              <w:pStyle w:val="Normal"/>
-              <w:keepNext w:val="true"/>
-              <w:bidi w:val="0"/>
-              <w:spacing w:lineRule="auto" w:line="240" w:before="0" w:after="0"/>
-              <w:ind w:hanging="0"/>
-              <w:jc w:val="start"/>
-              <w:rPr/>
-            </w:pPr>
-            <w:r>
-              <w:rPr>
-                <w:rFonts w:ascii="Times New Roman" w:hAnsi="Times New Roman"/>
-                <w:sz w:val="24"/>
+              <w:spacing w:before="20" w:after="20" w:line="276" w:lineRule="auto"/>
+            </w:pPr>
+            <w:r/>
+            <w:r>
+              <w:rPr>
+                <w:rFonts w:ascii="Times New Roman" w:hAnsi="Times New Roman"/>
+                <w:b/>
+                <w:sz w:val="21"/>
               </w:rPr>
               <w:t>Основной пользователь</w:t>
             </w:r>
@@ -4035,16 +3948,16 @@
           </w:tcPr>
           <w:p>
             <w:pPr>
-              <w:pStyle w:val="Normal"/>
-              <w:keepNext w:val="true"/>
-              <w:bidi w:val="0"/>
-              <w:spacing w:lineRule="auto" w:line="240" w:before="0" w:after="0"/>
-              <w:ind w:hanging="0"/>
-              <w:jc w:val="start"/>
-              <w:rPr/>
-            </w:pPr>
-            <w:r>
-              <w:rPr/>
+              <w:spacing w:before="20" w:after="20" w:line="276" w:lineRule="auto"/>
+            </w:pPr>
+            <w:r/>
+            <w:r>
+              <w:rPr>
+                <w:rFonts w:ascii="Times New Roman" w:hAnsi="Times New Roman"/>
+                <w:b w:val="0"/>
+                <w:sz w:val="21"/>
+              </w:rPr>
+              <w:t>Гость ресторана: выбирает дату, время, количество персон, осматривает 2D-схему залов и самостоятельно бронирует понравившийся стол.</w:t>
             </w:r>
           </w:p>
         </w:tc>
@@ -4060,16 +3973,16 @@
           </w:tcPr>
           <w:p>
             <w:pPr>
-              <w:pStyle w:val="Normal"/>
-              <w:keepNext w:val="true"/>
-              <w:bidi w:val="0"/>
-              <w:spacing w:lineRule="auto" w:line="240" w:before="0" w:after="0"/>
-              <w:ind w:hanging="0"/>
-              <w:jc w:val="start"/>
-              <w:rPr/>
-            </w:pPr>
-            <w:r>
-              <w:rPr/>
+              <w:spacing w:before="20" w:after="20" w:line="276" w:lineRule="auto"/>
+            </w:pPr>
+            <w:r/>
+            <w:r>
+              <w:rPr>
+                <w:rFonts w:ascii="Times New Roman" w:hAnsi="Times New Roman"/>
+                <w:b w:val="0"/>
+                <w:sz w:val="21"/>
+              </w:rPr>
+              <w:t>Быстро и гарантированно забронировать конкретный желаемый стол (у окна, в тихой зоне, на веранде) без звонков и ожидания подтверждения.</w:t>
             </w:r>
           </w:p>
         </w:tc>
@@ -4091,18 +4004,14 @@
           </w:tcPr>
           <w:p>
             <w:pPr>
-              <w:pStyle w:val="Normal"/>
-              <w:keepNext w:val="true"/>
-              <w:bidi w:val="0"/>
-              <w:spacing w:lineRule="auto" w:line="240" w:before="0" w:after="0"/>
-              <w:ind w:hanging="0"/>
-              <w:jc w:val="start"/>
-              <w:rPr/>
-            </w:pPr>
-            <w:r>
-              <w:rPr>
-                <w:rFonts w:ascii="Times New Roman" w:hAnsi="Times New Roman"/>
-                <w:sz w:val="24"/>
+              <w:spacing w:before="20" w:after="20" w:line="276" w:lineRule="auto"/>
+            </w:pPr>
+            <w:r/>
+            <w:r>
+              <w:rPr>
+                <w:rFonts w:ascii="Times New Roman" w:hAnsi="Times New Roman"/>
+                <w:b/>
+                <w:sz w:val="21"/>
               </w:rPr>
               <w:t>Вторичный пользователь</w:t>
             </w:r>
@@ -4120,16 +4029,16 @@
           </w:tcPr>
           <w:p>
             <w:pPr>
-              <w:pStyle w:val="Normal"/>
-              <w:keepNext w:val="true"/>
-              <w:bidi w:val="0"/>
-              <w:spacing w:lineRule="auto" w:line="240" w:before="0" w:after="0"/>
-              <w:ind w:hanging="0"/>
-              <w:jc w:val="start"/>
-              <w:rPr/>
-            </w:pPr>
-            <w:r>
-              <w:rPr/>
+              <w:spacing w:before="20" w:after="20" w:line="276" w:lineRule="auto"/>
+            </w:pPr>
+            <w:r/>
+            <w:r>
+              <w:rPr>
+                <w:rFonts w:ascii="Times New Roman" w:hAnsi="Times New Roman"/>
+                <w:b w:val="0"/>
+                <w:sz w:val="21"/>
+              </w:rPr>
+              <w:t>Конструктор схем (создает и редактирует планы залов) и менеджер зала / хостес (ведет журнал броней, фиксирует посадку и неявку гостей).</w:t>
             </w:r>
           </w:p>
         </w:tc>
@@ -4145,16 +4054,16 @@
           </w:tcPr>
           <w:p>
             <w:pPr>
-              <w:pStyle w:val="Normal"/>
-              <w:keepNext w:val="true"/>
-              <w:bidi w:val="0"/>
-              <w:spacing w:lineRule="auto" w:line="240" w:before="0" w:after="0"/>
-              <w:ind w:hanging="0"/>
-              <w:jc w:val="start"/>
-              <w:rPr/>
-            </w:pPr>
-            <w:r>
-              <w:rPr/>
+              <w:spacing w:before="20" w:after="20" w:line="276" w:lineRule="auto"/>
+            </w:pPr>
+            <w:r/>
+            <w:r>
+              <w:rPr>
+                <w:rFonts w:ascii="Times New Roman" w:hAnsi="Times New Roman"/>
+                <w:b w:val="0"/>
+                <w:sz w:val="21"/>
+              </w:rPr>
+              <w:t>Легко оцифровывать и менять схемы залов/столов без разработчиков, видеть прозрачную шахматку броней на смену и исключить овербукинг.</w:t>
             </w:r>
           </w:p>
         </w:tc>
@@ -4176,18 +4085,14 @@
           </w:tcPr>
           <w:p>
             <w:pPr>
-              <w:pStyle w:val="Normal"/>
-              <w:keepNext w:val="true"/>
-              <w:bidi w:val="0"/>
-              <w:spacing w:lineRule="auto" w:line="240" w:before="0" w:after="0"/>
-              <w:ind w:hanging="0"/>
-              <w:jc w:val="start"/>
-              <w:rPr/>
-            </w:pPr>
-            <w:r>
-              <w:rPr>
-                <w:rFonts w:ascii="Times New Roman" w:hAnsi="Times New Roman"/>
-                <w:sz w:val="24"/>
+              <w:spacing w:before="20" w:after="20" w:line="276" w:lineRule="auto"/>
+            </w:pPr>
+            <w:r/>
+            <w:r>
+              <w:rPr>
+                <w:rFonts w:ascii="Times New Roman" w:hAnsi="Times New Roman"/>
+                <w:b/>
+                <w:sz w:val="21"/>
               </w:rPr>
               <w:t>Заказчик</w:t>
             </w:r>
@@ -4205,16 +4110,16 @@
           </w:tcPr>
           <w:p>
             <w:pPr>
-              <w:pStyle w:val="Normal"/>
-              <w:keepNext w:val="true"/>
-              <w:bidi w:val="0"/>
-              <w:spacing w:lineRule="auto" w:line="240" w:before="0" w:after="0"/>
-              <w:ind w:hanging="0"/>
-              <w:jc w:val="start"/>
-              <w:rPr/>
-            </w:pPr>
-            <w:r>
-              <w:rPr/>
+              <w:spacing w:before="20" w:after="20" w:line="276" w:lineRule="auto"/>
+            </w:pPr>
+            <w:r/>
+            <w:r>
+              <w:rPr>
+                <w:rFonts w:ascii="Times New Roman" w:hAnsi="Times New Roman"/>
+                <w:b w:val="0"/>
+                <w:sz w:val="21"/>
+              </w:rPr>
+              <w:t>Владелец ресторана / управляющий заведением: принимает решение о внедрении системы в ресторане.</w:t>
             </w:r>
           </w:p>
         </w:tc>
@@ -4230,16 +4135,16 @@
           </w:tcPr>
           <w:p>
             <w:pPr>
-              <w:pStyle w:val="Normal"/>
-              <w:keepNext w:val="true"/>
-              <w:bidi w:val="0"/>
-              <w:spacing w:lineRule="auto" w:line="240" w:before="0" w:after="0"/>
-              <w:ind w:hanging="0"/>
-              <w:jc w:val="start"/>
-              <w:rPr/>
-            </w:pPr>
-            <w:r>
-              <w:rPr/>
+              <w:spacing w:before="20" w:after="20" w:line="276" w:lineRule="auto"/>
+            </w:pPr>
+            <w:r/>
+            <w:r>
+              <w:rPr>
+                <w:rFonts w:ascii="Times New Roman" w:hAnsi="Times New Roman"/>
+                <w:b w:val="0"/>
+                <w:sz w:val="21"/>
+              </w:rPr>
+              <w:t>Повысить заполняемость столов за счет онлайн-канала 24/7, не терять гостей при занятой телефонной линии и снизить нагрузку на персонал.</w:t>
             </w:r>
           </w:p>
         </w:tc>
@@ -4261,17 +4166,14 @@
           </w:tcPr>
           <w:p>
             <w:pPr>
-              <w:pStyle w:val="Normal"/>
-              <w:bidi w:val="0"/>
-              <w:spacing w:lineRule="auto" w:line="240" w:before="0" w:after="0"/>
-              <w:ind w:hanging="0"/>
-              <w:jc w:val="start"/>
-              <w:rPr/>
-            </w:pPr>
-            <w:r>
-              <w:rPr>
-                <w:rFonts w:ascii="Times New Roman" w:hAnsi="Times New Roman"/>
-                <w:sz w:val="24"/>
+              <w:spacing w:before="20" w:after="20" w:line="276" w:lineRule="auto"/>
+            </w:pPr>
+            <w:r/>
+            <w:r>
+              <w:rPr>
+                <w:rFonts w:ascii="Times New Roman" w:hAnsi="Times New Roman"/>
+                <w:b/>
+                <w:sz w:val="21"/>
               </w:rPr>
               <w:t>Другие заинтересованные стороны</w:t>
             </w:r>
@@ -4289,15 +4191,16 @@
           </w:tcPr>
           <w:p>
             <w:pPr>
-              <w:pStyle w:val="Normal"/>
-              <w:bidi w:val="0"/>
-              <w:spacing w:lineRule="auto" w:line="240" w:before="0" w:after="0"/>
-              <w:ind w:hanging="0"/>
-              <w:jc w:val="start"/>
-              <w:rPr/>
-            </w:pPr>
-            <w:r>
-              <w:rPr/>
+              <w:spacing w:before="20" w:after="20" w:line="276" w:lineRule="auto"/>
+            </w:pPr>
+            <w:r/>
+            <w:r>
+              <w:rPr>
+                <w:rFonts w:ascii="Times New Roman" w:hAnsi="Times New Roman"/>
+                <w:b w:val="0"/>
+                <w:sz w:val="21"/>
+              </w:rPr>
+              <w:t>Администратор IT-системы ресторана / персонал безопасности данных.</w:t>
             </w:r>
           </w:p>
         </w:tc>
@@ -4313,15 +4216,16 @@
           </w:tcPr>
           <w:p>
             <w:pPr>
-              <w:pStyle w:val="Normal"/>
-              <w:bidi w:val="0"/>
-              <w:spacing w:lineRule="auto" w:line="240" w:before="0" w:after="0"/>
-              <w:ind w:hanging="0"/>
-              <w:jc w:val="start"/>
-              <w:rPr/>
-            </w:pPr>
-            <w:r>
-              <w:rPr/>
+              <w:spacing w:before="20" w:after="20" w:line="276" w:lineRule="auto"/>
+            </w:pPr>
+            <w:r/>
+            <w:r>
+              <w:rPr>
+                <w:rFonts w:ascii="Times New Roman" w:hAnsi="Times New Roman"/>
+                <w:b w:val="0"/>
+                <w:sz w:val="21"/>
+              </w:rPr>
+              <w:t>Обеспечить стабильную и надежную работу веб-приложения, разграничение прав доступа и сохранность контактных данных гостей.</w:t>
             </w:r>
           </w:p>
         </w:tc>
@@ -5294,18 +5198,14 @@
           </w:tcPr>
           <w:p>
             <w:pPr>
-              <w:pStyle w:val="Normal"/>
-              <w:keepNext w:val="true"/>
-              <w:bidi w:val="0"/>
-              <w:spacing w:lineRule="auto" w:line="240" w:before="0" w:after="0"/>
-              <w:ind w:hanging="0"/>
-              <w:jc w:val="start"/>
-              <w:rPr/>
-            </w:pPr>
-            <w:r>
-              <w:rPr>
-                <w:rFonts w:ascii="Times New Roman" w:hAnsi="Times New Roman"/>
-                <w:sz w:val="24"/>
+              <w:spacing w:before="20" w:after="20" w:line="276" w:lineRule="auto"/>
+            </w:pPr>
+            <w:r/>
+            <w:r>
+              <w:rPr>
+                <w:rFonts w:ascii="Times New Roman" w:hAnsi="Times New Roman"/>
+                <w:b w:val="0"/>
+                <w:sz w:val="21"/>
               </w:rPr>
               <w:t>1</w:t>
             </w:r>
@@ -5323,16 +5223,16 @@
           </w:tcPr>
           <w:p>
             <w:pPr>
-              <w:pStyle w:val="Normal"/>
-              <w:keepNext w:val="true"/>
-              <w:bidi w:val="0"/>
-              <w:spacing w:lineRule="auto" w:line="240" w:before="0" w:after="0"/>
-              <w:ind w:hanging="0"/>
-              <w:jc w:val="start"/>
-              <w:rPr/>
-            </w:pPr>
-            <w:r>
-              <w:rPr/>
+              <w:spacing w:before="20" w:after="20" w:line="276" w:lineRule="auto"/>
+            </w:pPr>
+            <w:r/>
+            <w:r>
+              <w:rPr>
+                <w:rFonts w:ascii="Times New Roman" w:hAnsi="Times New Roman"/>
+                <w:b/>
+                <w:sz w:val="21"/>
+              </w:rPr>
+              <w:t>Сократить среднее время оформления бронирования стола гостем до 1-2 минут без необходимости звонка в ресторан.</w:t>
             </w:r>
           </w:p>
         </w:tc>
@@ -5348,16 +5248,16 @@
           </w:tcPr>
           <w:p>
             <w:pPr>
-              <w:pStyle w:val="Normal"/>
-              <w:keepNext w:val="true"/>
-              <w:bidi w:val="0"/>
-              <w:spacing w:lineRule="auto" w:line="240" w:before="0" w:after="0"/>
-              <w:ind w:hanging="0"/>
-              <w:jc w:val="start"/>
-              <w:rPr/>
-            </w:pPr>
-            <w:r>
-              <w:rPr/>
+              <w:spacing w:before="20" w:after="20" w:line="276" w:lineRule="auto"/>
+            </w:pPr>
+            <w:r/>
+            <w:r>
+              <w:rPr>
+                <w:rFonts w:ascii="Times New Roman" w:hAnsi="Times New Roman"/>
+                <w:b w:val="0"/>
+                <w:sz w:val="21"/>
+              </w:rPr>
+              <w:t>Гость ресторана, управляющий</w:t>
             </w:r>
           </w:p>
         </w:tc>
@@ -5373,16 +5273,16 @@
           </w:tcPr>
           <w:p>
             <w:pPr>
-              <w:pStyle w:val="Normal"/>
-              <w:keepNext w:val="true"/>
-              <w:bidi w:val="0"/>
-              <w:spacing w:lineRule="auto" w:line="240" w:before="0" w:after="0"/>
-              <w:ind w:hanging="0"/>
-              <w:jc w:val="start"/>
-              <w:rPr/>
-            </w:pPr>
-            <w:r>
-              <w:rPr/>
+              <w:spacing w:before="20" w:after="20" w:line="276" w:lineRule="auto"/>
+            </w:pPr>
+            <w:r/>
+            <w:r>
+              <w:rPr>
+                <w:rFonts w:ascii="Times New Roman" w:hAnsi="Times New Roman"/>
+                <w:b w:val="0"/>
+                <w:sz w:val="21"/>
+              </w:rPr>
+              <w:t>Хронометраж прохождения сценария от выбора времени до подтверждения брони в интерфейсе.</w:t>
             </w:r>
           </w:p>
         </w:tc>
@@ -5404,18 +5304,14 @@
           </w:tcPr>
           <w:p>
             <w:pPr>
-              <w:pStyle w:val="Normal"/>
-              <w:keepNext w:val="true"/>
-              <w:bidi w:val="0"/>
-              <w:spacing w:lineRule="auto" w:line="240" w:before="0" w:after="0"/>
-              <w:ind w:hanging="0"/>
-              <w:jc w:val="start"/>
-              <w:rPr/>
-            </w:pPr>
-            <w:r>
-              <w:rPr>
-                <w:rFonts w:ascii="Times New Roman" w:hAnsi="Times New Roman"/>
-                <w:sz w:val="24"/>
+              <w:spacing w:before="20" w:after="20" w:line="276" w:lineRule="auto"/>
+            </w:pPr>
+            <w:r/>
+            <w:r>
+              <w:rPr>
+                <w:rFonts w:ascii="Times New Roman" w:hAnsi="Times New Roman"/>
+                <w:b w:val="0"/>
+                <w:sz w:val="21"/>
               </w:rPr>
               <w:t>2</w:t>
             </w:r>
@@ -5433,16 +5329,16 @@
           </w:tcPr>
           <w:p>
             <w:pPr>
-              <w:pStyle w:val="Normal"/>
-              <w:keepNext w:val="true"/>
-              <w:bidi w:val="0"/>
-              <w:spacing w:lineRule="auto" w:line="240" w:before="0" w:after="0"/>
-              <w:ind w:hanging="0"/>
-              <w:jc w:val="start"/>
-              <w:rPr/>
-            </w:pPr>
-            <w:r>
-              <w:rPr/>
+              <w:spacing w:before="20" w:after="20" w:line="276" w:lineRule="auto"/>
+            </w:pPr>
+            <w:r/>
+            <w:r>
+              <w:rPr>
+                <w:rFonts w:ascii="Times New Roman" w:hAnsi="Times New Roman"/>
+                <w:b/>
+                <w:sz w:val="21"/>
+              </w:rPr>
+              <w:t>Исключить случаи овербукинга (двойных броней на один стол) и накладок между гостями за счет точного расчета интервалов и буфера.</w:t>
             </w:r>
           </w:p>
         </w:tc>
@@ -5458,16 +5354,16 @@
           </w:tcPr>
           <w:p>
             <w:pPr>
-              <w:pStyle w:val="Normal"/>
-              <w:keepNext w:val="true"/>
-              <w:bidi w:val="0"/>
-              <w:spacing w:lineRule="auto" w:line="240" w:before="0" w:after="0"/>
-              <w:ind w:hanging="0"/>
-              <w:jc w:val="start"/>
-              <w:rPr/>
-            </w:pPr>
-            <w:r>
-              <w:rPr/>
+              <w:spacing w:before="20" w:after="20" w:line="276" w:lineRule="auto"/>
+            </w:pPr>
+            <w:r/>
+            <w:r>
+              <w:rPr>
+                <w:rFonts w:ascii="Times New Roman" w:hAnsi="Times New Roman"/>
+                <w:b w:val="0"/>
+                <w:sz w:val="21"/>
+              </w:rPr>
+              <w:t>Менеджер зала (хостес), управляющий, гость</w:t>
             </w:r>
           </w:p>
         </w:tc>
@@ -5483,16 +5379,16 @@
           </w:tcPr>
           <w:p>
             <w:pPr>
-              <w:pStyle w:val="Normal"/>
-              <w:keepNext w:val="true"/>
-              <w:bidi w:val="0"/>
-              <w:spacing w:lineRule="auto" w:line="240" w:before="0" w:after="0"/>
-              <w:ind w:hanging="0"/>
-              <w:jc w:val="start"/>
-              <w:rPr/>
-            </w:pPr>
-            <w:r>
-              <w:rPr/>
+              <w:spacing w:before="20" w:after="20" w:line="276" w:lineRule="auto"/>
+            </w:pPr>
+            <w:r/>
+            <w:r>
+              <w:rPr>
+                <w:rFonts w:ascii="Times New Roman" w:hAnsi="Times New Roman"/>
+                <w:b w:val="0"/>
+                <w:sz w:val="21"/>
+              </w:rPr>
+              <w:t>Автоматические тесты на параллельное бронирование слотов с 15-минутным буфером; 0 инцидентов коллизий.</w:t>
             </w:r>
           </w:p>
         </w:tc>
@@ -5514,18 +5410,14 @@
           </w:tcPr>
           <w:p>
             <w:pPr>
-              <w:pStyle w:val="Normal"/>
-              <w:keepNext w:val="true"/>
-              <w:bidi w:val="0"/>
-              <w:spacing w:lineRule="auto" w:line="240" w:before="0" w:after="0"/>
-              <w:ind w:hanging="0"/>
-              <w:jc w:val="start"/>
-              <w:rPr/>
-            </w:pPr>
-            <w:r>
-              <w:rPr>
-                <w:rFonts w:ascii="Times New Roman" w:hAnsi="Times New Roman"/>
-                <w:sz w:val="24"/>
+              <w:spacing w:before="20" w:after="20" w:line="276" w:lineRule="auto"/>
+            </w:pPr>
+            <w:r/>
+            <w:r>
+              <w:rPr>
+                <w:rFonts w:ascii="Times New Roman" w:hAnsi="Times New Roman"/>
+                <w:b w:val="0"/>
+                <w:sz w:val="21"/>
               </w:rPr>
               <w:t>3</w:t>
             </w:r>
@@ -5543,16 +5435,16 @@
           </w:tcPr>
           <w:p>
             <w:pPr>
-              <w:pStyle w:val="Normal"/>
-              <w:keepNext w:val="true"/>
-              <w:bidi w:val="0"/>
-              <w:spacing w:lineRule="auto" w:line="240" w:before="0" w:after="0"/>
-              <w:ind w:hanging="0"/>
-              <w:jc w:val="start"/>
-              <w:rPr/>
-            </w:pPr>
-            <w:r>
-              <w:rPr/>
+              <w:spacing w:before="20" w:after="20" w:line="276" w:lineRule="auto"/>
+            </w:pPr>
+            <w:r/>
+            <w:r>
+              <w:rPr>
+                <w:rFonts w:ascii="Times New Roman" w:hAnsi="Times New Roman"/>
+                <w:b/>
+                <w:sz w:val="21"/>
+              </w:rPr>
+              <w:t>Обеспечить возможность визуальной оцифровки и публикации схемы зала ресторана за 15-30 минут без привлечения программистов.</w:t>
             </w:r>
           </w:p>
         </w:tc>
@@ -5568,16 +5460,16 @@
           </w:tcPr>
           <w:p>
             <w:pPr>
-              <w:pStyle w:val="Normal"/>
-              <w:keepNext w:val="true"/>
-              <w:bidi w:val="0"/>
-              <w:spacing w:lineRule="auto" w:line="240" w:before="0" w:after="0"/>
-              <w:ind w:hanging="0"/>
-              <w:jc w:val="start"/>
-              <w:rPr/>
-            </w:pPr>
-            <w:r>
-              <w:rPr/>
+              <w:spacing w:before="20" w:after="20" w:line="276" w:lineRule="auto"/>
+            </w:pPr>
+            <w:r/>
+            <w:r>
+              <w:rPr>
+                <w:rFonts w:ascii="Times New Roman" w:hAnsi="Times New Roman"/>
+                <w:b w:val="0"/>
+                <w:sz w:val="21"/>
+              </w:rPr>
+              <w:t>Конструктор схем, администратор заведения</w:t>
             </w:r>
           </w:p>
         </w:tc>
@@ -5593,16 +5485,16 @@
           </w:tcPr>
           <w:p>
             <w:pPr>
-              <w:pStyle w:val="Normal"/>
-              <w:keepNext w:val="true"/>
-              <w:bidi w:val="0"/>
-              <w:spacing w:lineRule="auto" w:line="240" w:before="0" w:after="0"/>
-              <w:ind w:hanging="0"/>
-              <w:jc w:val="start"/>
-              <w:rPr/>
-            </w:pPr>
-            <w:r>
-              <w:rPr/>
+              <w:spacing w:before="20" w:after="20" w:line="276" w:lineRule="auto"/>
+            </w:pPr>
+            <w:r/>
+            <w:r>
+              <w:rPr>
+                <w:rFonts w:ascii="Times New Roman" w:hAnsi="Times New Roman"/>
+                <w:b w:val="0"/>
+                <w:sz w:val="21"/>
+              </w:rPr>
+              <w:t>Хронометраж создания плана этажа (10-15 столов, 2-3 зоны) в веб-конструкторе до публикации ревизии.</w:t>
             </w:r>
           </w:p>
         </w:tc>
@@ -5624,18 +5516,14 @@
           </w:tcPr>
           <w:p>
             <w:pPr>
-              <w:pStyle w:val="Normal"/>
-              <w:keepNext w:val="true"/>
-              <w:bidi w:val="0"/>
-              <w:spacing w:lineRule="auto" w:line="240" w:before="0" w:after="0"/>
-              <w:ind w:hanging="0"/>
-              <w:jc w:val="start"/>
-              <w:rPr/>
-            </w:pPr>
-            <w:r>
-              <w:rPr>
-                <w:rFonts w:ascii="Times New Roman" w:hAnsi="Times New Roman"/>
-                <w:sz w:val="24"/>
+              <w:spacing w:before="20" w:after="20" w:line="276" w:lineRule="auto"/>
+            </w:pPr>
+            <w:r/>
+            <w:r>
+              <w:rPr>
+                <w:rFonts w:ascii="Times New Roman" w:hAnsi="Times New Roman"/>
+                <w:b w:val="0"/>
+                <w:sz w:val="21"/>
               </w:rPr>
               <w:t>4</w:t>
             </w:r>
@@ -5653,16 +5541,16 @@
           </w:tcPr>
           <w:p>
             <w:pPr>
-              <w:pStyle w:val="Normal"/>
-              <w:keepNext w:val="true"/>
-              <w:bidi w:val="0"/>
-              <w:spacing w:lineRule="auto" w:line="240" w:before="0" w:after="0"/>
-              <w:ind w:hanging="0"/>
-              <w:jc w:val="start"/>
-              <w:rPr/>
-            </w:pPr>
-            <w:r>
-              <w:rPr/>
+              <w:spacing w:before="20" w:after="20" w:line="276" w:lineRule="auto"/>
+            </w:pPr>
+            <w:r/>
+            <w:r>
+              <w:rPr>
+                <w:rFonts w:ascii="Times New Roman" w:hAnsi="Times New Roman"/>
+                <w:b/>
+                <w:sz w:val="21"/>
+              </w:rPr>
+              <w:t>Предоставить менеджеру зала наглядный инструмент контроля загрузки столов (шахматку) в режиме реального времени.</w:t>
             </w:r>
           </w:p>
         </w:tc>
@@ -5678,16 +5566,16 @@
           </w:tcPr>
           <w:p>
             <w:pPr>
-              <w:pStyle w:val="Normal"/>
-              <w:keepNext w:val="true"/>
-              <w:bidi w:val="0"/>
-              <w:spacing w:lineRule="auto" w:line="240" w:before="0" w:after="0"/>
-              <w:ind w:hanging="0"/>
-              <w:jc w:val="start"/>
-              <w:rPr/>
-            </w:pPr>
-            <w:r>
-              <w:rPr/>
+              <w:spacing w:before="20" w:after="20" w:line="276" w:lineRule="auto"/>
+            </w:pPr>
+            <w:r/>
+            <w:r>
+              <w:rPr>
+                <w:rFonts w:ascii="Times New Roman" w:hAnsi="Times New Roman"/>
+                <w:b w:val="0"/>
+                <w:sz w:val="21"/>
+              </w:rPr>
+              <w:t>Менеджер зала, хостес</w:t>
             </w:r>
           </w:p>
         </w:tc>
@@ -5703,16 +5591,16 @@
           </w:tcPr>
           <w:p>
             <w:pPr>
-              <w:pStyle w:val="Normal"/>
-              <w:keepNext w:val="true"/>
-              <w:bidi w:val="0"/>
-              <w:spacing w:lineRule="auto" w:line="240" w:before="0" w:after="0"/>
-              <w:ind w:hanging="0"/>
-              <w:jc w:val="start"/>
-              <w:rPr/>
-            </w:pPr>
-            <w:r>
-              <w:rPr/>
+              <w:spacing w:before="20" w:after="20" w:line="276" w:lineRule="auto"/>
+            </w:pPr>
+            <w:r/>
+            <w:r>
+              <w:rPr>
+                <w:rFonts w:ascii="Times New Roman" w:hAnsi="Times New Roman"/>
+                <w:b w:val="0"/>
+                <w:sz w:val="21"/>
+              </w:rPr>
+              <w:t>Проверка корректного отображения занятости столов («Свободен» / «Занят» / «Недоступен») на выбранное время с live-обновлением.</w:t>
             </w:r>
           </w:p>
         </w:tc>
@@ -5734,17 +5622,14 @@
           </w:tcPr>
           <w:p>
             <w:pPr>
-              <w:pStyle w:val="Normal"/>
-              <w:bidi w:val="0"/>
-              <w:spacing w:lineRule="auto" w:line="240" w:before="0" w:after="0"/>
-              <w:ind w:hanging="0"/>
-              <w:jc w:val="start"/>
-              <w:rPr/>
-            </w:pPr>
-            <w:r>
-              <w:rPr>
-                <w:rFonts w:ascii="Times New Roman" w:hAnsi="Times New Roman"/>
-                <w:sz w:val="24"/>
+              <w:spacing w:before="20" w:after="20" w:line="276" w:lineRule="auto"/>
+            </w:pPr>
+            <w:r/>
+            <w:r>
+              <w:rPr>
+                <w:rFonts w:ascii="Times New Roman" w:hAnsi="Times New Roman"/>
+                <w:b w:val="0"/>
+                <w:sz w:val="21"/>
               </w:rPr>
               <w:t>5</w:t>
             </w:r>
@@ -5762,15 +5647,16 @@
           </w:tcPr>
           <w:p>
             <w:pPr>
-              <w:pStyle w:val="Normal"/>
-              <w:bidi w:val="0"/>
-              <w:spacing w:lineRule="auto" w:line="240" w:before="0" w:after="0"/>
-              <w:ind w:hanging="0"/>
-              <w:jc w:val="start"/>
-              <w:rPr/>
-            </w:pPr>
-            <w:r>
-              <w:rPr/>
+              <w:spacing w:before="20" w:after="20" w:line="276" w:lineRule="auto"/>
+            </w:pPr>
+            <w:r/>
+            <w:r>
+              <w:rPr>
+                <w:rFonts w:ascii="Times New Roman" w:hAnsi="Times New Roman"/>
+                <w:b/>
+                <w:sz w:val="21"/>
+              </w:rPr>
+              <w:t>Гарантировать сохранность подтвержденных броней при перестановке и редактировании планировки ресторана.</w:t>
             </w:r>
           </w:p>
         </w:tc>
@@ -5786,15 +5672,16 @@
           </w:tcPr>
           <w:p>
             <w:pPr>
-              <w:pStyle w:val="Normal"/>
-              <w:bidi w:val="0"/>
-              <w:spacing w:lineRule="auto" w:line="240" w:before="0" w:after="0"/>
-              <w:ind w:hanging="0"/>
-              <w:jc w:val="start"/>
-              <w:rPr/>
-            </w:pPr>
-            <w:r>
-              <w:rPr/>
+              <w:spacing w:before="20" w:after="20" w:line="276" w:lineRule="auto"/>
+            </w:pPr>
+            <w:r/>
+            <w:r>
+              <w:rPr>
+                <w:rFonts w:ascii="Times New Roman" w:hAnsi="Times New Roman"/>
+                <w:b w:val="0"/>
+                <w:sz w:val="21"/>
+              </w:rPr>
+              <w:t>Управляющий, администратор, гости</w:t>
             </w:r>
           </w:p>
         </w:tc>
@@ -5810,15 +5697,16 @@
           </w:tcPr>
           <w:p>
             <w:pPr>
-              <w:pStyle w:val="Normal"/>
-              <w:bidi w:val="0"/>
-              <w:spacing w:lineRule="auto" w:line="240" w:before="0" w:after="0"/>
-              <w:ind w:hanging="0"/>
-              <w:jc w:val="start"/>
-              <w:rPr/>
-            </w:pPr>
-            <w:r>
-              <w:rPr/>
+              <w:spacing w:before="20" w:after="20" w:line="276" w:lineRule="auto"/>
+            </w:pPr>
+            <w:r/>
+            <w:r>
+              <w:rPr>
+                <w:rFonts w:ascii="Times New Roman" w:hAnsi="Times New Roman"/>
+                <w:b w:val="0"/>
+                <w:sz w:val="21"/>
+              </w:rPr>
+              <w:t>Тестирование валидатора схемы: блокировка публикации при попытке удалить стол с будущими активными бронями.</w:t>
             </w:r>
           </w:p>
         </w:tc>
@@ -5944,16 +5832,16 @@
           </w:tcPr>
           <w:p>
             <w:pPr>
-              <w:pStyle w:val="Normal"/>
-              <w:keepNext w:val="true"/>
-              <w:bidi w:val="0"/>
-              <w:spacing w:lineRule="auto" w:line="240" w:before="0" w:after="0"/>
-              <w:ind w:hanging="0"/>
-              <w:jc w:val="start"/>
-              <w:rPr/>
-            </w:pPr>
-            <w:r>
-              <w:rPr/>
+              <w:spacing w:before="20" w:after="20" w:line="276" w:lineRule="auto"/>
+            </w:pPr>
+            <w:r/>
+            <w:r>
+              <w:rPr>
+                <w:rFonts w:ascii="Times New Roman" w:hAnsi="Times New Roman"/>
+                <w:b/>
+                <w:sz w:val="21"/>
+              </w:rPr>
+              <w:t>Интерактивный 2D-конструктор схем залов (создание этажей, рисование полигонов зон, расстановка столов)</w:t>
             </w:r>
           </w:p>
         </w:tc>
@@ -5969,16 +5857,16 @@
           </w:tcPr>
           <w:p>
             <w:pPr>
-              <w:pStyle w:val="Normal"/>
-              <w:keepNext w:val="true"/>
-              <w:bidi w:val="0"/>
-              <w:spacing w:lineRule="auto" w:line="240" w:before="0" w:after="0"/>
-              <w:ind w:hanging="0"/>
-              <w:jc w:val="start"/>
-              <w:rPr/>
-            </w:pPr>
-            <w:r>
-              <w:rPr/>
+              <w:spacing w:before="20" w:after="20" w:line="276" w:lineRule="auto"/>
+            </w:pPr>
+            <w:r/>
+            <w:r>
+              <w:rPr>
+                <w:rFonts w:ascii="Times New Roman" w:hAnsi="Times New Roman"/>
+                <w:b w:val="0"/>
+                <w:sz w:val="21"/>
+              </w:rPr>
+              <w:t>Обслуживание гостей за столом в зале по QR-коду (заказ и дозаказ блюд официанту)</w:t>
             </w:r>
           </w:p>
         </w:tc>
@@ -6000,16 +5888,16 @@
           </w:tcPr>
           <w:p>
             <w:pPr>
-              <w:pStyle w:val="Normal"/>
-              <w:keepNext w:val="true"/>
-              <w:bidi w:val="0"/>
-              <w:spacing w:lineRule="auto" w:line="240" w:before="0" w:after="0"/>
-              <w:ind w:hanging="0"/>
-              <w:jc w:val="start"/>
-              <w:rPr/>
-            </w:pPr>
-            <w:r>
-              <w:rPr/>
+              <w:spacing w:before="20" w:after="20" w:line="276" w:lineRule="auto"/>
+            </w:pPr>
+            <w:r/>
+            <w:r>
+              <w:rPr>
+                <w:rFonts w:ascii="Times New Roman" w:hAnsi="Times New Roman"/>
+                <w:b/>
+                <w:sz w:val="21"/>
+              </w:rPr>
+              <w:t>Настройка параметров столов (круглые, квадратные, прямоугольные, габариты, свободный поворот 0-360°)</w:t>
             </w:r>
           </w:p>
         </w:tc>
@@ -6025,16 +5913,16 @@
           </w:tcPr>
           <w:p>
             <w:pPr>
-              <w:pStyle w:val="Normal"/>
-              <w:keepNext w:val="true"/>
-              <w:bidi w:val="0"/>
-              <w:spacing w:lineRule="auto" w:line="240" w:before="0" w:after="0"/>
-              <w:ind w:hanging="0"/>
-              <w:jc w:val="start"/>
-              <w:rPr/>
-            </w:pPr>
-            <w:r>
-              <w:rPr/>
+              <w:spacing w:before="20" w:after="20" w:line="276" w:lineRule="auto"/>
+            </w:pPr>
+            <w:r/>
+            <w:r>
+              <w:rPr>
+                <w:rFonts w:ascii="Times New Roman" w:hAnsi="Times New Roman"/>
+                <w:b w:val="0"/>
+                <w:sz w:val="21"/>
+              </w:rPr>
+              <w:t>Электронное меню блюд, технологические карты, модификаторы и стоп-листы блюд</w:t>
             </w:r>
           </w:p>
         </w:tc>
@@ -6056,16 +5944,16 @@
           </w:tcPr>
           <w:p>
             <w:pPr>
-              <w:pStyle w:val="Normal"/>
-              <w:keepNext w:val="true"/>
-              <w:bidi w:val="0"/>
-              <w:spacing w:lineRule="auto" w:line="240" w:before="0" w:after="0"/>
-              <w:ind w:hanging="0"/>
-              <w:jc w:val="start"/>
-              <w:rPr/>
-            </w:pPr>
-            <w:r>
-              <w:rPr/>
+              <w:spacing w:before="20" w:after="20" w:line="276" w:lineRule="auto"/>
+            </w:pPr>
+            <w:r/>
+            <w:r>
+              <w:rPr>
+                <w:rFonts w:ascii="Times New Roman" w:hAnsi="Times New Roman"/>
+                <w:b/>
+                <w:sz w:val="21"/>
+              </w:rPr>
+              <w:t>Версионирование схем залов (хранение снимков LayoutRevision в JSONB, история и откат ревизий)</w:t>
             </w:r>
           </w:p>
         </w:tc>
@@ -6081,16 +5969,16 @@
           </w:tcPr>
           <w:p>
             <w:pPr>
-              <w:pStyle w:val="Normal"/>
-              <w:keepNext w:val="true"/>
-              <w:bidi w:val="0"/>
-              <w:spacing w:lineRule="auto" w:line="240" w:before="0" w:after="0"/>
-              <w:ind w:hanging="0"/>
-              <w:jc w:val="start"/>
-              <w:rPr/>
-            </w:pPr>
-            <w:r>
-              <w:rPr/>
+              <w:spacing w:before="20" w:after="20" w:line="276" w:lineRule="auto"/>
+            </w:pPr>
+            <w:r/>
+            <w:r>
+              <w:rPr>
+                <w:rFonts w:ascii="Times New Roman" w:hAnsi="Times New Roman"/>
+                <w:b w:val="0"/>
+                <w:sz w:val="21"/>
+              </w:rPr>
+              <w:t>Экран кухни (KDS / кухонный дисплей) и отслеживание статусов приготовления блюд</w:t>
             </w:r>
           </w:p>
         </w:tc>
@@ -6112,16 +6000,16 @@
           </w:tcPr>
           <w:p>
             <w:pPr>
-              <w:pStyle w:val="Normal"/>
-              <w:keepNext w:val="true"/>
-              <w:bidi w:val="0"/>
-              <w:spacing w:lineRule="auto" w:line="240" w:before="0" w:after="0"/>
-              <w:ind w:hanging="0"/>
-              <w:jc w:val="start"/>
-              <w:rPr/>
-            </w:pPr>
-            <w:r>
-              <w:rPr/>
+              <w:spacing w:before="20" w:after="20" w:line="276" w:lineRule="auto"/>
+            </w:pPr>
+            <w:r/>
+            <w:r>
+              <w:rPr>
+                <w:rFonts w:ascii="Times New Roman" w:hAnsi="Times New Roman"/>
+                <w:b/>
+                <w:sz w:val="21"/>
+              </w:rPr>
+              <w:t>Гостевой модуль онлайн-бронирования с интерактивным выбором свободного стола на 2D-карте зала</w:t>
             </w:r>
           </w:p>
         </w:tc>
@@ -6137,16 +6025,16 @@
           </w:tcPr>
           <w:p>
             <w:pPr>
-              <w:pStyle w:val="Normal"/>
-              <w:keepNext w:val="true"/>
-              <w:bidi w:val="0"/>
-              <w:spacing w:lineRule="auto" w:line="240" w:before="0" w:after="0"/>
-              <w:ind w:hanging="0"/>
-              <w:jc w:val="start"/>
-              <w:rPr/>
-            </w:pPr>
-            <w:r>
-              <w:rPr/>
+              <w:spacing w:before="20" w:after="20" w:line="276" w:lineRule="auto"/>
+            </w:pPr>
+            <w:r/>
+            <w:r>
+              <w:rPr>
+                <w:rFonts w:ascii="Times New Roman" w:hAnsi="Times New Roman"/>
+                <w:b w:val="0"/>
+                <w:sz w:val="21"/>
+              </w:rPr>
+              <w:t>Роль официанта, закрепление официантов за зонами ресторана и ведение рабочих смен</w:t>
             </w:r>
           </w:p>
         </w:tc>
@@ -6168,16 +6056,16 @@
           </w:tcPr>
           <w:p>
             <w:pPr>
-              <w:pStyle w:val="Normal"/>
-              <w:keepNext w:val="true"/>
-              <w:bidi w:val="0"/>
-              <w:spacing w:lineRule="auto" w:line="240" w:before="0" w:after="0"/>
-              <w:ind w:hanging="0"/>
-              <w:jc w:val="start"/>
-              <w:rPr/>
-            </w:pPr>
-            <w:r>
-              <w:rPr/>
+              <w:spacing w:before="20" w:after="20" w:line="276" w:lineRule="auto"/>
+            </w:pPr>
+            <w:r/>
+            <w:r>
+              <w:rPr>
+                <w:rFonts w:ascii="Times New Roman" w:hAnsi="Times New Roman"/>
+                <w:b/>
+                <w:sz w:val="21"/>
+              </w:rPr>
+              <w:t>Расчет доступности столов на запрашиваемый временной интервал с учетом буфера 15 минут на подготовку</w:t>
             </w:r>
           </w:p>
         </w:tc>
@@ -6193,16 +6081,16 @@
           </w:tcPr>
           <w:p>
             <w:pPr>
-              <w:pStyle w:val="Normal"/>
-              <w:keepNext w:val="true"/>
-              <w:bidi w:val="0"/>
-              <w:spacing w:lineRule="auto" w:line="240" w:before="0" w:after="0"/>
-              <w:ind w:hanging="0"/>
-              <w:jc w:val="start"/>
-              <w:rPr/>
-            </w:pPr>
-            <w:r>
-              <w:rPr/>
+              <w:spacing w:before="20" w:after="20" w:line="276" w:lineRule="auto"/>
+            </w:pPr>
+            <w:r/>
+            <w:r>
+              <w:rPr>
+                <w:rFonts w:ascii="Times New Roman" w:hAnsi="Times New Roman"/>
+                <w:b w:val="0"/>
+                <w:sz w:val="21"/>
+              </w:rPr>
+              <w:t>Прием онлайн-оплаты, интеграция с платежными шлюзами (эквайринг, СБП) и фискализация чеков</w:t>
             </w:r>
           </w:p>
         </w:tc>
@@ -6224,15 +6112,16 @@
           </w:tcPr>
           <w:p>
             <w:pPr>
-              <w:pStyle w:val="Normal"/>
-              <w:bidi w:val="0"/>
-              <w:spacing w:lineRule="auto" w:line="240" w:before="0" w:after="0"/>
-              <w:ind w:hanging="0"/>
-              <w:jc w:val="start"/>
-              <w:rPr/>
-            </w:pPr>
-            <w:r>
-              <w:rPr/>
+              <w:spacing w:before="20" w:after="20" w:line="276" w:lineRule="auto"/>
+            </w:pPr>
+            <w:r/>
+            <w:r>
+              <w:rPr>
+                <w:rFonts w:ascii="Times New Roman" w:hAnsi="Times New Roman"/>
+                <w:b/>
+                <w:sz w:val="21"/>
+              </w:rPr>
+              <w:t>Панель менеджера: календарная шахматка броней, ручной перенос/отмена, фиксация неявки (no-show)</w:t>
             </w:r>
           </w:p>
         </w:tc>
@@ -6248,15 +6137,16 @@
           </w:tcPr>
           <w:p>
             <w:pPr>
-              <w:pStyle w:val="Normal"/>
-              <w:bidi w:val="0"/>
-              <w:spacing w:lineRule="auto" w:line="240" w:before="0" w:after="0"/>
-              <w:ind w:hanging="0"/>
-              <w:jc w:val="start"/>
-              <w:rPr/>
-            </w:pPr>
-            <w:r>
-              <w:rPr/>
+              <w:spacing w:before="20" w:after="20" w:line="276" w:lineRule="auto"/>
+            </w:pPr>
+            <w:r/>
+            <w:r>
+              <w:rPr>
+                <w:rFonts w:ascii="Times New Roman" w:hAnsi="Times New Roman"/>
+                <w:b w:val="0"/>
+                <w:sz w:val="21"/>
+              </w:rPr>
+              <w:t>3D-визуализация интерьера зала и поддержка нескольких ресторанов (мульти-аренда)</w:t>
             </w:r>
           </w:p>
         </w:tc>
@@ -6382,16 +6272,16 @@
           </w:tcPr>
           <w:p>
             <w:pPr>
-              <w:pStyle w:val="Normal"/>
-              <w:keepNext w:val="true"/>
-              <w:bidi w:val="0"/>
-              <w:spacing w:lineRule="auto" w:line="240" w:before="0" w:after="0"/>
-              <w:ind w:hanging="0"/>
-              <w:jc w:val="start"/>
-              <w:rPr/>
-            </w:pPr>
-            <w:r>
-              <w:rPr/>
+              <w:spacing w:before="20" w:after="20" w:line="276" w:lineRule="auto"/>
+            </w:pPr>
+            <w:r/>
+            <w:r>
+              <w:rPr>
+                <w:rFonts w:ascii="Times New Roman" w:hAnsi="Times New Roman"/>
+                <w:b/>
+                <w:sz w:val="21"/>
+              </w:rPr>
+              <w:t>У сервисов-агрегаторов (Яндекс Карты) бронирование ведется «вслепую» без выбора конкретного места, хотя для гостей принципиально расположение стола (у окна, в тихом углу).</w:t>
             </w:r>
           </w:p>
         </w:tc>
@@ -6407,16 +6297,16 @@
           </w:tcPr>
           <w:p>
             <w:pPr>
-              <w:pStyle w:val="Normal"/>
-              <w:keepNext w:val="true"/>
-              <w:bidi w:val="0"/>
-              <w:spacing w:lineRule="auto" w:line="240" w:before="0" w:after="0"/>
-              <w:ind w:hanging="0"/>
-              <w:jc w:val="start"/>
-              <w:rPr/>
-            </w:pPr>
-            <w:r>
-              <w:rPr/>
+              <w:spacing w:before="20" w:after="20" w:line="276" w:lineRule="auto"/>
+            </w:pPr>
+            <w:r/>
+            <w:r>
+              <w:rPr>
+                <w:rFonts w:ascii="Times New Roman" w:hAnsi="Times New Roman"/>
+                <w:b w:val="0"/>
+                <w:sz w:val="21"/>
+              </w:rPr>
+              <w:t>Сделали интерактивную 2D-карту зала ключевым элементом гостевого сценария: гость видит планировку и кликом выбирает понравившийся свободный стол.</w:t>
             </w:r>
           </w:p>
         </w:tc>
@@ -6438,16 +6328,16 @@
           </w:tcPr>
           <w:p>
             <w:pPr>
-              <w:pStyle w:val="Normal"/>
-              <w:keepNext w:val="true"/>
-              <w:bidi w:val="0"/>
-              <w:spacing w:lineRule="auto" w:line="240" w:before="0" w:after="0"/>
-              <w:ind w:hanging="0"/>
-              <w:jc w:val="start"/>
-              <w:rPr/>
-            </w:pPr>
-            <w:r>
-              <w:rPr/>
+              <w:spacing w:before="20" w:after="20" w:line="276" w:lineRule="auto"/>
+            </w:pPr>
+            <w:r/>
+            <w:r>
+              <w:rPr>
+                <w:rFonts w:ascii="Times New Roman" w:hAnsi="Times New Roman"/>
+                <w:b/>
+                <w:sz w:val="21"/>
+              </w:rPr>
+              <w:t>Профессиональные САПР-редакторы (Floorplanner) перегружены строительными деталями (толщина стен, материалы, 3D), что непригодно для ресторанного персонала.</w:t>
             </w:r>
           </w:p>
         </w:tc>
@@ -6463,16 +6353,16 @@
           </w:tcPr>
           <w:p>
             <w:pPr>
-              <w:pStyle w:val="Normal"/>
-              <w:keepNext w:val="true"/>
-              <w:bidi w:val="0"/>
-              <w:spacing w:lineRule="auto" w:line="240" w:before="0" w:after="0"/>
-              <w:ind w:hanging="0"/>
-              <w:jc w:val="start"/>
-              <w:rPr/>
-            </w:pPr>
-            <w:r>
-              <w:rPr/>
+              <w:spacing w:before="20" w:after="20" w:line="276" w:lineRule="auto"/>
+            </w:pPr>
+            <w:r/>
+            <w:r>
+              <w:rPr>
+                <w:rFonts w:ascii="Times New Roman" w:hAnsi="Times New Roman"/>
+                <w:b w:val="0"/>
+                <w:sz w:val="21"/>
+              </w:rPr>
+              <w:t>Спроектировали специализированный 2D-конструктор: простой холст с привязкой к сетке, полигонами функциональных зон и базовыми геометрическими формами столов.</w:t>
             </w:r>
           </w:p>
         </w:tc>
@@ -6494,16 +6384,16 @@
           </w:tcPr>
           <w:p>
             <w:pPr>
-              <w:pStyle w:val="Normal"/>
-              <w:keepNext w:val="true"/>
-              <w:bidi w:val="0"/>
-              <w:spacing w:lineRule="auto" w:line="240" w:before="0" w:after="0"/>
-              <w:ind w:hanging="0"/>
-              <w:jc w:val="start"/>
-              <w:rPr/>
-            </w:pPr>
-            <w:r>
-              <w:rPr/>
+              <w:spacing w:before="20" w:after="20" w:line="276" w:lineRule="auto"/>
+            </w:pPr>
+            <w:r/>
+            <w:r>
+              <w:rPr>
+                <w:rFonts w:ascii="Times New Roman" w:hAnsi="Times New Roman"/>
+                <w:b/>
+                <w:sz w:val="21"/>
+              </w:rPr>
+              <w:t>При ручном учете (текущий способ) регулярно возникают накладки из-за отсутствия времени на уборку и подготовку стола между уходом одного гостя и приходом следующего.</w:t>
             </w:r>
           </w:p>
         </w:tc>
@@ -6519,16 +6409,16 @@
           </w:tcPr>
           <w:p>
             <w:pPr>
-              <w:pStyle w:val="Normal"/>
-              <w:keepNext w:val="true"/>
-              <w:bidi w:val="0"/>
-              <w:spacing w:lineRule="auto" w:line="240" w:before="0" w:after="0"/>
-              <w:ind w:hanging="0"/>
-              <w:jc w:val="start"/>
-              <w:rPr/>
-            </w:pPr>
-            <w:r>
-              <w:rPr/>
+              <w:spacing w:before="20" w:after="20" w:line="276" w:lineRule="auto"/>
+            </w:pPr>
+            <w:r/>
+            <w:r>
+              <w:rPr>
+                <w:rFonts w:ascii="Times New Roman" w:hAnsi="Times New Roman"/>
+                <w:b w:val="0"/>
+                <w:sz w:val="21"/>
+              </w:rPr>
+              <w:t>Заложили обязательный автоматический технический буфер 15 минут после окончания каждой брони при проверке пересечения интервалов в БД.</w:t>
             </w:r>
           </w:p>
         </w:tc>
@@ -6550,15 +6440,16 @@
           </w:tcPr>
           <w:p>
             <w:pPr>
-              <w:pStyle w:val="Normal"/>
-              <w:bidi w:val="0"/>
-              <w:spacing w:lineRule="auto" w:line="240" w:before="0" w:after="0"/>
-              <w:ind w:hanging="0"/>
-              <w:jc w:val="start"/>
-              <w:rPr/>
-            </w:pPr>
-            <w:r>
-              <w:rPr/>
+              <w:spacing w:before="20" w:after="20" w:line="276" w:lineRule="auto"/>
+            </w:pPr>
+            <w:r/>
+            <w:r>
+              <w:rPr>
+                <w:rFonts w:ascii="Times New Roman" w:hAnsi="Times New Roman"/>
+                <w:b/>
+                <w:sz w:val="21"/>
+              </w:rPr>
+              <w:t>В существующих ресторанных системах перестановка мебели в зале может случайно стереть стол с оформленными на него бронями.</w:t>
             </w:r>
           </w:p>
         </w:tc>
@@ -6574,15 +6465,16 @@
           </w:tcPr>
           <w:p>
             <w:pPr>
-              <w:pStyle w:val="Normal"/>
-              <w:bidi w:val="0"/>
-              <w:spacing w:lineRule="auto" w:line="240" w:before="0" w:after="0"/>
-              <w:ind w:hanging="0"/>
-              <w:jc w:val="start"/>
-              <w:rPr/>
-            </w:pPr>
-            <w:r>
-              <w:rPr/>
+              <w:spacing w:before="20" w:after="20" w:line="276" w:lineRule="auto"/>
+            </w:pPr>
+            <w:r/>
+            <w:r>
+              <w:rPr>
+                <w:rFonts w:ascii="Times New Roman" w:hAnsi="Times New Roman"/>
+                <w:b w:val="0"/>
+                <w:sz w:val="21"/>
+              </w:rPr>
+              <w:t>Ввели строгое бизнес-правило: блокировка публикации изменений схемы, если в редакторе удаляется стол или уменьшается вместимость при наличии будущих активных броней.</w:t>
             </w:r>
           </w:p>
         </w:tc>
@@ -7040,18 +6932,14 @@
           </w:tcPr>
           <w:p>
             <w:pPr>
-              <w:pStyle w:val="Normal"/>
-              <w:keepNext w:val="true"/>
-              <w:bidi w:val="0"/>
-              <w:spacing w:lineRule="auto" w:line="240" w:before="0" w:after="0"/>
-              <w:ind w:hanging="0"/>
-              <w:jc w:val="start"/>
-              <w:rPr/>
-            </w:pPr>
-            <w:r>
-              <w:rPr>
-                <w:rFonts w:ascii="Times New Roman" w:hAnsi="Times New Roman"/>
-                <w:sz w:val="24"/>
+              <w:spacing w:before="20" w:after="20" w:line="276" w:lineRule="auto"/>
+            </w:pPr>
+            <w:r/>
+            <w:r>
+              <w:rPr>
+                <w:rFonts w:ascii="Times New Roman" w:hAnsi="Times New Roman"/>
+                <w:b w:val="0"/>
+                <w:sz w:val="21"/>
               </w:rPr>
               <w:t>1</w:t>
             </w:r>
@@ -7069,16 +6957,16 @@
           </w:tcPr>
           <w:p>
             <w:pPr>
-              <w:pStyle w:val="Normal"/>
-              <w:keepNext w:val="true"/>
-              <w:bidi w:val="0"/>
-              <w:spacing w:lineRule="auto" w:line="240" w:before="0" w:after="0"/>
-              <w:ind w:hanging="0"/>
-              <w:jc w:val="start"/>
-              <w:rPr/>
-            </w:pPr>
-            <w:r>
-              <w:rPr/>
+              <w:spacing w:before="20" w:after="20" w:line="276" w:lineRule="auto"/>
+            </w:pPr>
+            <w:r/>
+            <w:r>
+              <w:rPr>
+                <w:rFonts w:ascii="Times New Roman" w:hAnsi="Times New Roman"/>
+                <w:b/>
+                <w:sz w:val="21"/>
+              </w:rPr>
+              <w:t>Когда вы в последний раз бронировали стол в ресторане, насколько для вас было важно выбрать конкретное посадочное место (например, у окна или на веранде), и как вы согласовывали это с заведением?</w:t>
             </w:r>
           </w:p>
         </w:tc>
@@ -7094,16 +6982,15 @@
           </w:tcPr>
           <w:p>
             <w:pPr>
-              <w:pStyle w:val="Normal"/>
-              <w:keepNext w:val="true"/>
-              <w:bidi w:val="0"/>
-              <w:spacing w:lineRule="auto" w:line="240" w:before="0" w:after="0"/>
-              <w:ind w:hanging="0"/>
-              <w:jc w:val="start"/>
-              <w:rPr/>
-            </w:pPr>
-            <w:r>
-              <w:rPr/>
+              <w:spacing w:before="20" w:after="20" w:line="276" w:lineRule="auto"/>
+            </w:pPr>
+            <w:r/>
+            <w:r>
+              <w:rPr>
+                <w:rFonts w:ascii="Times New Roman" w:hAnsi="Times New Roman"/>
+                <w:b w:val="0"/>
+                <w:sz w:val="21"/>
+              </w:rPr>
             </w:r>
           </w:p>
         </w:tc>
@@ -7119,16 +7006,15 @@
           </w:tcPr>
           <w:p>
             <w:pPr>
-              <w:pStyle w:val="Normal"/>
-              <w:keepNext w:val="true"/>
-              <w:bidi w:val="0"/>
-              <w:spacing w:lineRule="auto" w:line="240" w:before="0" w:after="0"/>
-              <w:ind w:hanging="0"/>
-              <w:jc w:val="start"/>
-              <w:rPr/>
-            </w:pPr>
-            <w:r>
-              <w:rPr/>
+              <w:spacing w:before="20" w:after="20" w:line="276" w:lineRule="auto"/>
+            </w:pPr>
+            <w:r/>
+            <w:r>
+              <w:rPr>
+                <w:rFonts w:ascii="Times New Roman" w:hAnsi="Times New Roman"/>
+                <w:b w:val="0"/>
+                <w:sz w:val="21"/>
+              </w:rPr>
             </w:r>
           </w:p>
         </w:tc>
@@ -7150,18 +7036,14 @@
           </w:tcPr>
           <w:p>
             <w:pPr>
-              <w:pStyle w:val="Normal"/>
-              <w:keepNext w:val="true"/>
-              <w:bidi w:val="0"/>
-              <w:spacing w:lineRule="auto" w:line="240" w:before="0" w:after="0"/>
-              <w:ind w:hanging="0"/>
-              <w:jc w:val="start"/>
-              <w:rPr/>
-            </w:pPr>
-            <w:r>
-              <w:rPr>
-                <w:rFonts w:ascii="Times New Roman" w:hAnsi="Times New Roman"/>
-                <w:sz w:val="24"/>
+              <w:spacing w:before="20" w:after="20" w:line="276" w:lineRule="auto"/>
+            </w:pPr>
+            <w:r/>
+            <w:r>
+              <w:rPr>
+                <w:rFonts w:ascii="Times New Roman" w:hAnsi="Times New Roman"/>
+                <w:b w:val="0"/>
+                <w:sz w:val="21"/>
               </w:rPr>
               <w:t>2</w:t>
             </w:r>
@@ -7179,16 +7061,16 @@
           </w:tcPr>
           <w:p>
             <w:pPr>
-              <w:pStyle w:val="Normal"/>
-              <w:keepNext w:val="true"/>
-              <w:bidi w:val="0"/>
-              <w:spacing w:lineRule="auto" w:line="240" w:before="0" w:after="0"/>
-              <w:ind w:hanging="0"/>
-              <w:jc w:val="start"/>
-              <w:rPr/>
-            </w:pPr>
-            <w:r>
-              <w:rPr/>
+              <w:spacing w:before="20" w:after="20" w:line="276" w:lineRule="auto"/>
+            </w:pPr>
+            <w:r/>
+            <w:r>
+              <w:rPr>
+                <w:rFonts w:ascii="Times New Roman" w:hAnsi="Times New Roman"/>
+                <w:b/>
+                <w:sz w:val="21"/>
+              </w:rPr>
+              <w:t>С какими накладками или ошибками вы сталкивались при учете бронирований в бумажном журнале или таблице за последнюю рабочую неделю (двойная посадка, нехватка времени на уборку стола, опоздания гостей)?</w:t>
             </w:r>
           </w:p>
         </w:tc>
@@ -7204,16 +7086,15 @@
           </w:tcPr>
           <w:p>
             <w:pPr>
-              <w:pStyle w:val="Normal"/>
-              <w:keepNext w:val="true"/>
-              <w:bidi w:val="0"/>
-              <w:spacing w:lineRule="auto" w:line="240" w:before="0" w:after="0"/>
-              <w:ind w:hanging="0"/>
-              <w:jc w:val="start"/>
-              <w:rPr/>
-            </w:pPr>
-            <w:r>
-              <w:rPr/>
+              <w:spacing w:before="20" w:after="20" w:line="276" w:lineRule="auto"/>
+            </w:pPr>
+            <w:r/>
+            <w:r>
+              <w:rPr>
+                <w:rFonts w:ascii="Times New Roman" w:hAnsi="Times New Roman"/>
+                <w:b w:val="0"/>
+                <w:sz w:val="21"/>
+              </w:rPr>
             </w:r>
           </w:p>
         </w:tc>
@@ -7229,16 +7110,15 @@
           </w:tcPr>
           <w:p>
             <w:pPr>
-              <w:pStyle w:val="Normal"/>
-              <w:keepNext w:val="true"/>
-              <w:bidi w:val="0"/>
-              <w:spacing w:lineRule="auto" w:line="240" w:before="0" w:after="0"/>
-              <w:ind w:hanging="0"/>
-              <w:jc w:val="start"/>
-              <w:rPr/>
-            </w:pPr>
-            <w:r>
-              <w:rPr/>
+              <w:spacing w:before="20" w:after="20" w:line="276" w:lineRule="auto"/>
+            </w:pPr>
+            <w:r/>
+            <w:r>
+              <w:rPr>
+                <w:rFonts w:ascii="Times New Roman" w:hAnsi="Times New Roman"/>
+                <w:b w:val="0"/>
+                <w:sz w:val="21"/>
+              </w:rPr>
             </w:r>
           </w:p>
         </w:tc>
@@ -7260,17 +7140,14 @@
           </w:tcPr>
           <w:p>
             <w:pPr>
-              <w:pStyle w:val="Normal"/>
-              <w:bidi w:val="0"/>
-              <w:spacing w:lineRule="auto" w:line="240" w:before="0" w:after="0"/>
-              <w:ind w:hanging="0"/>
-              <w:jc w:val="start"/>
-              <w:rPr/>
-            </w:pPr>
-            <w:r>
-              <w:rPr>
-                <w:rFonts w:ascii="Times New Roman" w:hAnsi="Times New Roman"/>
-                <w:sz w:val="24"/>
+              <w:spacing w:before="20" w:after="20" w:line="276" w:lineRule="auto"/>
+            </w:pPr>
+            <w:r/>
+            <w:r>
+              <w:rPr>
+                <w:rFonts w:ascii="Times New Roman" w:hAnsi="Times New Roman"/>
+                <w:b w:val="0"/>
+                <w:sz w:val="21"/>
               </w:rPr>
               <w:t>3</w:t>
             </w:r>
@@ -7288,15 +7165,16 @@
           </w:tcPr>
           <w:p>
             <w:pPr>
-              <w:pStyle w:val="Normal"/>
-              <w:bidi w:val="0"/>
-              <w:spacing w:lineRule="auto" w:line="240" w:before="0" w:after="0"/>
-              <w:ind w:hanging="0"/>
-              <w:jc w:val="start"/>
-              <w:rPr/>
-            </w:pPr>
-            <w:r>
-              <w:rPr/>
+              <w:spacing w:before="20" w:after="20" w:line="276" w:lineRule="auto"/>
+            </w:pPr>
+            <w:r/>
+            <w:r>
+              <w:rPr>
+                <w:rFonts w:ascii="Times New Roman" w:hAnsi="Times New Roman"/>
+                <w:b/>
+                <w:sz w:val="21"/>
+              </w:rPr>
+              <w:t>Сколько времени у вас уходит на перестановку или изменение схемы столов в зале при проведении банкетов или смене сезона, и как вы фиксируете эти изменения для хостес?</w:t>
             </w:r>
           </w:p>
         </w:tc>
@@ -7312,15 +7190,15 @@
           </w:tcPr>
           <w:p>
             <w:pPr>
-              <w:pStyle w:val="Normal"/>
-              <w:bidi w:val="0"/>
-              <w:spacing w:lineRule="auto" w:line="240" w:before="0" w:after="0"/>
-              <w:ind w:hanging="0"/>
-              <w:jc w:val="start"/>
-              <w:rPr/>
-            </w:pPr>
-            <w:r>
-              <w:rPr/>
+              <w:spacing w:before="20" w:after="20" w:line="276" w:lineRule="auto"/>
+            </w:pPr>
+            <w:r/>
+            <w:r>
+              <w:rPr>
+                <w:rFonts w:ascii="Times New Roman" w:hAnsi="Times New Roman"/>
+                <w:b w:val="0"/>
+                <w:sz w:val="21"/>
+              </w:rPr>
             </w:r>
           </w:p>
         </w:tc>
@@ -7336,15 +7214,15 @@
           </w:tcPr>
           <w:p>
             <w:pPr>
-              <w:pStyle w:val="Normal"/>
-              <w:bidi w:val="0"/>
-              <w:spacing w:lineRule="auto" w:line="240" w:before="0" w:after="0"/>
-              <w:ind w:hanging="0"/>
-              <w:jc w:val="start"/>
-              <w:rPr/>
-            </w:pPr>
-            <w:r>
-              <w:rPr/>
+              <w:spacing w:before="20" w:after="20" w:line="276" w:lineRule="auto"/>
+            </w:pPr>
+            <w:r/>
+            <w:r>
+              <w:rPr>
+                <w:rFonts w:ascii="Times New Roman" w:hAnsi="Times New Roman"/>
+                <w:b w:val="0"/>
+                <w:sz w:val="21"/>
+              </w:rPr>
             </w:r>
           </w:p>
         </w:tc>

</xml_diff>